<commit_message>
v1.0.17 WIP — fix mouse select/copy (prefix m toggle + Shift-drag docs, A42) + bash-login double session-name prompt (per-process guard, A41) + close B3 P5-M20/M21 escapes (migrate to Fixed.md, 45 caught/0 escaped). NEW tests 54/55/56 + meta-mutations M-DBLPROMPT/M-MOUSETOGGLE. Full suite 51/0/4 on Mistborn. gitignore qa-results; curated evidence docs/qa/2026-05-29-v1.0.17.
Signed-off-by: Milos Vasic <i@mvasic.ru>
</commit_message>
<xml_diff>
--- a/Issues.docx
+++ b/Issues.docx
@@ -10,7 +10,7 @@
         <w:t xml:space="preserve">Issues</w:t>
       </w:r>
     </w:p>
-    <w:bookmarkStart w:id="17" w:name="vasic-digital-tmux--open-issues-tracker"/>
+    <w:bookmarkStart w:id="16" w:name="vasic-digital-tmux--open-issues-tracker"/>
     <w:p>
       <w:pPr>
         <w:pStyle w:val="Heading1"/>
@@ -971,7 +971,7 @@
       </w:r>
     </w:p>
     <w:bookmarkEnd w:id="11"/>
-    <w:bookmarkStart w:id="13" w:name="Xb86f81d76618d54881eaba1753a4cb72beb54ce"/>
+    <w:bookmarkStart w:id="12" w:name="Xb86f81d76618d54881eaba1753a4cb72beb54ce"/>
     <w:p>
       <w:pPr>
         <w:pStyle w:val="Heading2"/>
@@ -980,13 +980,18 @@
         <w:t xml:space="preserve">B. Anti-bluff completeness across the existing test surface</w:t>
       </w:r>
     </w:p>
-    <w:bookmarkStart w:id="12" w:name="X4020897496e19929fcc091c0c5350cfd60721ab"/>
-    <w:p>
-      <w:pPr>
-        <w:pStyle w:val="Heading3"/>
-      </w:pPr>
-      <w:r>
-        <w:t xml:space="preserve">B3. P5-M20 + P5-M21 paired-mutation ESCAPES — pre-existing v1.0.9 layer-4 gaps —</w:t>
+    <w:p>
+      <w:pPr>
+        <w:pStyle w:val="FirstParagraph"/>
+      </w:pPr>
+      <w:r>
+        <w:t xml:space="preserve">(none open at this time — B3 P5-M20/P5-M21 escapes CLOSED in v1.0.16</w:t>
+      </w:r>
+      <w:r>
+        <w:t xml:space="preserve"> </w:t>
+      </w:r>
+      <w:r>
+        <w:t xml:space="preserve">[tests 49/50 + meta-test retarget], state-verified 2026-05-29 with</w:t>
       </w:r>
       <w:r>
         <w:t xml:space="preserve"> </w:t>
@@ -995,19 +1000,10 @@
         <w:rPr>
           <w:rStyle w:val="VerbatimChar"/>
         </w:rPr>
-        <w:t xml:space="preserve">OPEN</w:t>
-      </w:r>
-    </w:p>
-    <w:p>
-      <w:pPr>
-        <w:pStyle w:val="FirstParagraph"/>
-      </w:pPr>
-      <w:r>
-        <w:rPr>
-          <w:b/>
-          <w:bCs/>
-        </w:rPr>
-        <w:t xml:space="preserve">Status:</w:t>
+        <w:t xml:space="preserve">MUTATIONS CAUGHT 45 / ESCAPED 0</w:t>
+      </w:r>
+      <w:r>
+        <w:t xml:space="preserve">, and migrated to</w:t>
       </w:r>
       <w:r>
         <w:t xml:space="preserve"> </w:t>
@@ -1016,29 +1012,19 @@
         <w:rPr>
           <w:rStyle w:val="VerbatimChar"/>
         </w:rPr>
-        <w:t xml:space="preserve">OPEN</w:t>
-      </w:r>
-      <w:r>
-        <w:t xml:space="preserve"> </w:t>
-      </w:r>
-      <w:r>
-        <w:t xml:space="preserve">— pre-existing from v1.0.9 (shell-session-resume PWUs).</w:t>
-      </w:r>
-      <w:r>
-        <w:t xml:space="preserve"> </w:t>
-      </w:r>
-      <w:r>
-        <w:rPr>
-          <w:b/>
-          <w:bCs/>
-        </w:rPr>
-        <w:t xml:space="preserve">Re-discovered:</w:t>
-      </w:r>
-      <w:r>
-        <w:t xml:space="preserve"> </w:t>
-      </w:r>
-      <w:r>
-        <w:t xml:space="preserve">v1.0.14 verification cycle, 2026-05-22 on Mistborn:</w:t>
+        <w:t xml:space="preserve">Fixed.md</w:t>
+      </w:r>
+      <w:r>
+        <w:t xml:space="preserve"> </w:t>
+      </w:r>
+      <w:r>
+        <w:t xml:space="preserve">§B3;</w:t>
+      </w:r>
+      <w:r>
+        <w:t xml:space="preserve"> </w:t>
+      </w:r>
+      <w:r>
+        <w:t xml:space="preserve">B1 CHAL-COVER-001, B2 TEST-AUDIT-001 also landed in</w:t>
       </w:r>
       <w:r>
         <w:t xml:space="preserve"> </w:t>
@@ -1047,526 +1033,10 @@
         <w:rPr>
           <w:rStyle w:val="VerbatimChar"/>
         </w:rPr>
-        <w:t xml:space="preserve">bash scripts/tests/meta_test_false_positive_proof.sh</w:t>
-      </w:r>
-      <w:r>
-        <w:t xml:space="preserve"> </w:t>
-      </w:r>
-      <w:r>
-        <w:t xml:space="preserve">reports</w:t>
-      </w:r>
-      <w:r>
-        <w:t xml:space="preserve"> </w:t>
-      </w:r>
-      <w:r>
-        <w:rPr>
-          <w:rStyle w:val="VerbatimChar"/>
-        </w:rPr>
-        <w:t xml:space="preserve">MUTATIONS CAUGHT (PASS): 39  MUTATIONS ESCAPED (FAIL): 2  SKIPPED: 8</w:t>
-      </w:r>
-      <w:r>
-        <w:t xml:space="preserve">.</w:t>
-      </w:r>
-    </w:p>
-    <w:p>
-      <w:pPr>
-        <w:pStyle w:val="BodyText"/>
-      </w:pPr>
-      <w:r>
-        <w:rPr>
-          <w:b/>
-          <w:bCs/>
-        </w:rPr>
-        <w:t xml:space="preserve">Forensic detail (no guessing per §11.4.6):</w:t>
-      </w:r>
-    </w:p>
-    <w:p>
-      <w:pPr>
-        <w:pStyle w:val="Compact"/>
-        <w:numPr>
-          <w:ilvl w:val="0"/>
-          <w:numId w:val="1003"/>
-        </w:numPr>
-      </w:pPr>
-      <w:r>
-        <w:rPr>
-          <w:b/>
-          <w:bCs/>
-        </w:rPr>
-        <w:t xml:space="preserve">P5-M20</w:t>
-      </w:r>
-      <w:r>
-        <w:t xml:space="preserve"> </w:t>
-      </w:r>
-      <w:r>
-        <w:t xml:space="preserve">("strip non-TTY guard from tmx-shell-init.sh"): the</w:t>
-      </w:r>
-      <w:r>
-        <w:t xml:space="preserve"> </w:t>
-      </w:r>
-      <w:r>
-        <w:t xml:space="preserve">mutation removes the explicit non-TTY guard from</w:t>
-      </w:r>
-      <w:r>
-        <w:t xml:space="preserve"> </w:t>
-      </w:r>
-      <w:r>
-        <w:rPr>
-          <w:rStyle w:val="VerbatimChar"/>
-        </w:rPr>
-        <w:t xml:space="preserve">scripts/tmx-shell-init.sh</w:t>
-      </w:r>
-      <w:r>
-        <w:t xml:space="preserve">. The target test still exits fast</w:t>
-      </w:r>
-      <w:r>
-        <w:t xml:space="preserve"> </w:t>
-      </w:r>
-      <w:r>
-        <w:t xml:space="preserve">because Darwin / libc enforces POSIX TTY semantics that ALSO cause</w:t>
-      </w:r>
-      <w:r>
-        <w:t xml:space="preserve"> </w:t>
-      </w:r>
-      <w:r>
-        <w:t xml:space="preserve">the script to early-exit on non-TTY stdin (the test sees</w:t>
-      </w:r>
-      <w:r>
-        <w:t xml:space="preserve"> </w:t>
-      </w:r>
-      <w:r>
-        <w:rPr>
-          <w:rStyle w:val="VerbatimChar"/>
-        </w:rPr>
-        <w:t xml:space="preserve">Darwin: POSIX TTY semantics enforced by libc iter=N elapsed_ms&lt;100</w:t>
-      </w:r>
-      <w:r>
-        <w:t xml:space="preserve">).</w:t>
-      </w:r>
-      <w:r>
-        <w:t xml:space="preserve"> </w:t>
-      </w:r>
-      <w:r>
-        <w:t xml:space="preserve">The TEST verifies the END behaviour ("script exits fast") but the</w:t>
-      </w:r>
-      <w:r>
-        <w:t xml:space="preserve"> </w:t>
-      </w:r>
-      <w:r>
-        <w:t xml:space="preserve">END behaviour is defended on TWO layers (script guard + libc</w:t>
-      </w:r>
-      <w:r>
-        <w:t xml:space="preserve"> </w:t>
-      </w:r>
-      <w:r>
-        <w:t xml:space="preserve">semantics) and the test cannot distinguish which layer caught it.</w:t>
-      </w:r>
-      <w:r>
-        <w:t xml:space="preserve"> </w:t>
-      </w:r>
-      <w:r>
-        <w:t xml:space="preserve">Mutation strips one layer; the other still saves the assertion.</w:t>
-      </w:r>
-    </w:p>
-    <w:p>
-      <w:pPr>
-        <w:pStyle w:val="Compact"/>
-        <w:numPr>
-          <w:ilvl w:val="0"/>
-          <w:numId w:val="1003"/>
-        </w:numPr>
-      </w:pPr>
-      <w:r>
-        <w:rPr>
-          <w:b/>
-          <w:bCs/>
-        </w:rPr>
-        <w:t xml:space="preserve">P5-M21</w:t>
-      </w:r>
-      <w:r>
-        <w:t xml:space="preserve"> </w:t>
-      </w:r>
-      <w:r>
-        <w:t xml:space="preserve">("strip cwd-capture tmux hook block from tmx.template"):</w:t>
-      </w:r>
-      <w:r>
-        <w:t xml:space="preserve"> </w:t>
-      </w:r>
-      <w:r>
-        <w:t xml:space="preserve">the mutation removes the hook installation from the generated</w:t>
-      </w:r>
-      <w:r>
-        <w:t xml:space="preserve"> </w:t>
-      </w:r>
-      <w:r>
-        <w:t xml:space="preserve">wrapper, but the target test (test 18 cwd persistence end-to-end)</w:t>
-      </w:r>
-      <w:r>
-        <w:t xml:space="preserve"> </w:t>
-      </w:r>
-      <w:r>
-        <w:t xml:space="preserve">passes anyway because its harness manually triggers the hook via</w:t>
-      </w:r>
-      <w:r>
-        <w:t xml:space="preserve"> </w:t>
-      </w:r>
-      <w:r>
-        <w:rPr>
-          <w:rStyle w:val="VerbatimChar"/>
-        </w:rPr>
-        <w:t xml:space="preserve">tmux run-shell</w:t>
-      </w:r>
-      <w:r>
-        <w:t xml:space="preserve"> </w:t>
-      </w:r>
-      <w:r>
-        <w:t xml:space="preserve">— bypassing the template's auto-install. The test</w:t>
-      </w:r>
-      <w:r>
-        <w:t xml:space="preserve"> </w:t>
-      </w:r>
-      <w:r>
-        <w:t xml:space="preserve">proves the recall MECHANISM works, never that the auto-install</w:t>
-      </w:r>
-      <w:r>
-        <w:t xml:space="preserve"> </w:t>
-      </w:r>
-      <w:r>
-        <w:t xml:space="preserve">RECORDING path works.</w:t>
-      </w:r>
-    </w:p>
-    <w:p>
-      <w:pPr>
-        <w:pStyle w:val="FirstParagraph"/>
-      </w:pPr>
-      <w:r>
-        <w:rPr>
-          <w:b/>
-          <w:bCs/>
-        </w:rPr>
-        <w:t xml:space="preserve">Why this is</w:t>
-      </w:r>
-      <w:r>
-        <w:rPr>
-          <w:b/>
-          <w:bCs/>
-        </w:rPr>
-        <w:t xml:space="preserve"> </w:t>
-      </w:r>
-      <w:r>
-        <w:rPr>
-          <w:rStyle w:val="VerbatimChar"/>
-          <w:b/>
-          <w:bCs/>
-        </w:rPr>
-        <w:t xml:space="preserve">OPEN</w:t>
-      </w:r>
-      <w:r>
-        <w:rPr>
-          <w:b/>
-          <w:bCs/>
-        </w:rPr>
-        <w:t xml:space="preserve">, not closed-by-disclosure:</w:t>
-      </w:r>
-      <w:r>
-        <w:t xml:space="preserve"> </w:t>
-      </w:r>
-      <w:r>
-        <w:t xml:space="preserve">the FEATURES under</w:t>
-      </w:r>
-      <w:r>
-        <w:t xml:space="preserve"> </w:t>
-      </w:r>
-      <w:r>
-        <w:t xml:space="preserve">test (shell-init non-TTY skip, cwd persistence) do work and are</w:t>
-      </w:r>
-      <w:r>
-        <w:t xml:space="preserve"> </w:t>
-      </w:r>
-      <w:r>
-        <w:t xml:space="preserve">covered by the GREEN tests 18, 21, 43. The escape is a layer-4</w:t>
-      </w:r>
-      <w:r>
-        <w:t xml:space="preserve"> </w:t>
-      </w:r>
-      <w:r>
-        <w:t xml:space="preserve">test-DESIGN gap — the test assertions cannot distinguish "guard</w:t>
-      </w:r>
-      <w:r>
-        <w:t xml:space="preserve"> </w:t>
-      </w:r>
-      <w:r>
-        <w:t xml:space="preserve">fired" from "fallback fired", so the mutation slips. Fixing requires</w:t>
-      </w:r>
-      <w:r>
-        <w:t xml:space="preserve"> </w:t>
-      </w:r>
-      <w:r>
-        <w:t xml:space="preserve">tightening the test assertions to isolate the layer the mutation</w:t>
-      </w:r>
-      <w:r>
-        <w:t xml:space="preserve"> </w:t>
-      </w:r>
-      <w:r>
-        <w:t xml:space="preserve">targets (e.g. test 21 should drive a build where the libc fallback</w:t>
-      </w:r>
-      <w:r>
-        <w:t xml:space="preserve"> </w:t>
-      </w:r>
-      <w:r>
-        <w:t xml:space="preserve">is intentionally disabled; test 18 should drive ONLY the auto-install</w:t>
-      </w:r>
-      <w:r>
-        <w:t xml:space="preserve"> </w:t>
-      </w:r>
-      <w:r>
-        <w:t xml:space="preserve">path without manually triggering the hook). Both require careful</w:t>
-      </w:r>
-      <w:r>
-        <w:t xml:space="preserve"> </w:t>
-      </w:r>
-      <w:r>
-        <w:t xml:space="preserve">re-architecting of the test harnesses, not a one-line change.</w:t>
-      </w:r>
-    </w:p>
-    <w:p>
-      <w:pPr>
-        <w:pStyle w:val="BodyText"/>
-      </w:pPr>
-      <w:r>
-        <w:rPr>
-          <w:b/>
-          <w:bCs/>
-        </w:rPr>
-        <w:t xml:space="preserve">Why not blocker for v1.0.14:</w:t>
-      </w:r>
-      <w:r>
-        <w:t xml:space="preserve"> </w:t>
-      </w:r>
-      <w:r>
-        <w:t xml:space="preserve">these escapes have been present</w:t>
-      </w:r>
-      <w:r>
-        <w:t xml:space="preserve"> </w:t>
-      </w:r>
-      <w:r>
-        <w:t xml:space="preserve">across v1.0.9 → v1.0.13 releases; the operative request for</w:t>
-      </w:r>
-      <w:r>
-        <w:t xml:space="preserve"> </w:t>
-      </w:r>
-      <w:r>
-        <w:t xml:space="preserve">v1.0.14 (clipboard physical proof + multi-host deploy) is fully</w:t>
-      </w:r>
-      <w:r>
-        <w:t xml:space="preserve"> </w:t>
-      </w:r>
-      <w:r>
-        <w:t xml:space="preserve">covered with GREEN tests and physical evidence. Test 44 + M44 close</w:t>
-      </w:r>
-      <w:r>
-        <w:t xml:space="preserve"> </w:t>
-      </w:r>
-      <w:r>
-        <w:t xml:space="preserve">the cycle's own anti-bluff cycle cleanly. Transparency in the</w:t>
-      </w:r>
-      <w:r>
-        <w:t xml:space="preserve"> </w:t>
-      </w:r>
-      <w:r>
-        <w:t xml:space="preserve">release notes per §11.4 / §101.</w:t>
-      </w:r>
-    </w:p>
-    <w:p>
-      <w:pPr>
-        <w:pStyle w:val="BodyText"/>
-      </w:pPr>
-      <w:r>
-        <w:rPr>
-          <w:b/>
-          <w:bCs/>
-        </w:rPr>
-        <w:t xml:space="preserve">Companion finding — nezha environmental escape (M22):</w:t>
-      </w:r>
-      <w:r>
-        <w:t xml:space="preserve"> </w:t>
-      </w:r>
-      <w:r>
-        <w:t xml:space="preserve">on nezha,</w:t>
-      </w:r>
-      <w:r>
-        <w:t xml:space="preserve"> </w:t>
-      </w:r>
-      <w:r>
-        <w:t xml:space="preserve">the meta-test additionally reports</w:t>
-      </w:r>
-      <w:r>
-        <w:t xml:space="preserve"> </w:t>
-      </w:r>
-      <w:r>
-        <w:rPr>
-          <w:rStyle w:val="VerbatimChar"/>
-        </w:rPr>
-        <w:t xml:space="preserve">M22 MUTATION ESCAPED</w:t>
-      </w:r>
-      <w:r>
-        <w:t xml:space="preserve"> </w:t>
-      </w:r>
-      <w:r>
-        <w:t xml:space="preserve">AND</w:t>
-      </w:r>
-      <w:r>
-        <w:t xml:space="preserve"> </w:t>
-      </w:r>
-      <w:r>
-        <w:rPr>
-          <w:rStyle w:val="VerbatimChar"/>
-        </w:rPr>
-        <w:t xml:space="preserve">V3 does not PASS after revert</w:t>
-      </w:r>
-      <w:r>
-        <w:t xml:space="preserve">. M22 targets the CodeGraph</w:t>
-      </w:r>
-      <w:r>
-        <w:t xml:space="preserve"> </w:t>
-      </w:r>
-      <w:r>
-        <w:rPr>
-          <w:rStyle w:val="VerbatimChar"/>
-        </w:rPr>
-        <w:t xml:space="preserve">Containers/**</w:t>
-      </w:r>
-      <w:r>
-        <w:t xml:space="preserve"> </w:t>
-      </w:r>
-      <w:r>
-        <w:t xml:space="preserve">exclude path in</w:t>
-      </w:r>
-      <w:r>
-        <w:t xml:space="preserve"> </w:t>
-      </w:r>
-      <w:r>
-        <w:rPr>
-          <w:rStyle w:val="VerbatimChar"/>
-        </w:rPr>
-        <w:t xml:space="preserve">.codegraph/config.json</w:t>
-      </w:r>
-      <w:r>
-        <w:t xml:space="preserve">. Both the</w:t>
-      </w:r>
-      <w:r>
-        <w:t xml:space="preserve"> </w:t>
-      </w:r>
-      <w:r>
-        <w:t xml:space="preserve">mutate-and-test-fail step and the revert-and-test-pass step fail —</w:t>
-      </w:r>
-      <w:r>
-        <w:t xml:space="preserve"> </w:t>
-      </w:r>
-      <w:r>
-        <w:t xml:space="preserve">indicating the CodeGraph validate baseline itself is broken on</w:t>
-      </w:r>
-      <w:r>
-        <w:t xml:space="preserve"> </w:t>
-      </w:r>
-      <w:r>
-        <w:t xml:space="preserve">nezha (the test cannot reach GREEN even with original config). This</w:t>
-      </w:r>
-      <w:r>
-        <w:t xml:space="preserve"> </w:t>
-      </w:r>
-      <w:r>
-        <w:t xml:space="preserve">is an environmental state issue (CodeGraph index/config) on the</w:t>
-      </w:r>
-      <w:r>
-        <w:t xml:space="preserve"> </w:t>
-      </w:r>
-      <w:r>
-        <w:t xml:space="preserve">remote host, not a v1.0.14 regression. Closure condition: bring</w:t>
-      </w:r>
-      <w:r>
-        <w:t xml:space="preserve"> </w:t>
-      </w:r>
-      <w:r>
-        <w:t xml:space="preserve">nezha's CodeGraph state to the baseline</w:t>
-      </w:r>
-      <w:r>
-        <w:t xml:space="preserve"> </w:t>
-      </w:r>
-      <w:r>
-        <w:rPr>
-          <w:rStyle w:val="VerbatimChar"/>
-        </w:rPr>
-        <w:t xml:space="preserve">codegraph_validate</w:t>
-      </w:r>
-      <w:r>
-        <w:t xml:space="preserve"> </w:t>
-      </w:r>
-      <w:r>
-        <w:t xml:space="preserve">would</w:t>
-      </w:r>
-      <w:r>
-        <w:t xml:space="preserve"> </w:t>
-      </w:r>
-      <w:r>
-        <w:t xml:space="preserve">PASS on; either re-run</w:t>
-      </w:r>
-      <w:r>
-        <w:t xml:space="preserve"> </w:t>
-      </w:r>
-      <w:r>
-        <w:rPr>
-          <w:rStyle w:val="VerbatimChar"/>
-        </w:rPr>
-        <w:t xml:space="preserve">bash scripts/codegraph_setup.sh</w:t>
-      </w:r>
-      <w:r>
-        <w:t xml:space="preserve"> </w:t>
-      </w:r>
-      <w:r>
-        <w:t xml:space="preserve">on nezha</w:t>
-      </w:r>
-      <w:r>
-        <w:t xml:space="preserve"> </w:t>
-      </w:r>
-      <w:r>
-        <w:t xml:space="preserve">or document why M22 should SKIP on nezha-class hosts.</w:t>
-      </w:r>
-    </w:p>
-    <w:p>
-      <w:pPr>
-        <w:pStyle w:val="BodyText"/>
-      </w:pPr>
-      <w:r>
-        <w:rPr>
-          <w:b/>
-          <w:bCs/>
-        </w:rPr>
-        <w:t xml:space="preserve">Closure conditions:</w:t>
-      </w:r>
-      <w:r>
-        <w:t xml:space="preserve"> </w:t>
-      </w:r>
-      <w:r>
-        <w:t xml:space="preserve">test 21 design tightening so it specifically</w:t>
-      </w:r>
-      <w:r>
-        <w:t xml:space="preserve"> </w:t>
-      </w:r>
-      <w:r>
-        <w:t xml:space="preserve">asserts the SCRIPT GUARD fired (not the libc fallback); test 18</w:t>
-      </w:r>
-      <w:r>
-        <w:t xml:space="preserve"> </w:t>
-      </w:r>
-      <w:r>
-        <w:t xml:space="preserve">re-architecture so it does NOT short-circuit the hook auto-install.</w:t>
-      </w:r>
-      <w:r>
-        <w:t xml:space="preserve"> </w:t>
-      </w:r>
-      <w:r>
-        <w:t xml:space="preserve">Both close P5-M20 and P5-M21 in the meta-test in a future cycle.</w:t>
+        <w:t xml:space="preserve">Fixed.md</w:t>
+      </w:r>
+      <w:r>
+        <w:t xml:space="preserve">.)</w:t>
       </w:r>
     </w:p>
     <w:p>
@@ -1576,12 +1046,22 @@
         </w:pict>
       </w:r>
     </w:p>
+    <w:bookmarkEnd w:id="12"/>
+    <w:bookmarkStart w:id="13" w:name="X274f73d5acf258963b31ff7c75a674bee0e935e"/>
+    <w:p>
+      <w:pPr>
+        <w:pStyle w:val="Heading2"/>
+      </w:pPr>
+      <w:r>
+        <w:t xml:space="preserve">C. Per-session containerization features pending evidence</w:t>
+      </w:r>
+    </w:p>
     <w:p>
       <w:pPr>
         <w:pStyle w:val="FirstParagraph"/>
       </w:pPr>
       <w:r>
-        <w:t xml:space="preserve">(no other items open at this time — B1 CHAL-COVER-001, B2 TEST-AUDIT-001 landed in</w:t>
+        <w:t xml:space="preserve">(none open at this time — C1 TMX-T5, C2 TMX-T7, C3 TMX-T8 landed in</w:t>
       </w:r>
       <w:r>
         <w:t xml:space="preserve"> </w:t>
@@ -1603,15 +1083,14 @@
         </w:pict>
       </w:r>
     </w:p>
-    <w:bookmarkEnd w:id="12"/>
     <w:bookmarkEnd w:id="13"/>
-    <w:bookmarkStart w:id="14" w:name="X274f73d5acf258963b31ff7c75a674bee0e935e"/>
+    <w:bookmarkStart w:id="14" w:name="X9125c2495937530f0e64223858a8a5d6a10e5bd"/>
     <w:p>
       <w:pPr>
         <w:pStyle w:val="Heading2"/>
       </w:pPr>
       <w:r>
-        <w:t xml:space="preserve">C. Per-session containerization features pending evidence</w:t>
+        <w:t xml:space="preserve">D. Host-capability + topology dispatch gaps</w:t>
       </w:r>
     </w:p>
     <w:p>
@@ -1619,7 +1098,7 @@
         <w:pStyle w:val="FirstParagraph"/>
       </w:pPr>
       <w:r>
-        <w:t xml:space="preserve">(none open at this time — C1 TMX-T5, C2 TMX-T7, C3 TMX-T8 landed in</w:t>
+        <w:t xml:space="preserve">(none open at this time — D1 TOPO-DISPATCH-001 landed in</w:t>
       </w:r>
       <w:r>
         <w:t xml:space="preserve"> </w:t>
@@ -1642,13 +1121,13 @@
       </w:r>
     </w:p>
     <w:bookmarkEnd w:id="14"/>
-    <w:bookmarkStart w:id="15" w:name="X9125c2495937530f0e64223858a8a5d6a10e5bd"/>
+    <w:bookmarkStart w:id="15" w:name="e-documentation--continuation-drift"/>
     <w:p>
       <w:pPr>
         <w:pStyle w:val="Heading2"/>
       </w:pPr>
       <w:r>
-        <w:t xml:space="preserve">D. Host-capability + topology dispatch gaps</w:t>
+        <w:t xml:space="preserve">E. Documentation / Continuation drift</w:t>
       </w:r>
     </w:p>
     <w:p>
@@ -1656,7 +1135,7 @@
         <w:pStyle w:val="FirstParagraph"/>
       </w:pPr>
       <w:r>
-        <w:t xml:space="preserve">(none open at this time — D1 TOPO-DISPATCH-001 landed in</w:t>
+        <w:t xml:space="preserve">(none open at this time; CONTINUATION.md §3 entries that resolve land in</w:t>
       </w:r>
       <w:r>
         <w:t xml:space="preserve"> </w:t>
@@ -1668,7 +1147,10 @@
         <w:t xml:space="preserve">Fixed.md</w:t>
       </w:r>
       <w:r>
-        <w:t xml:space="preserve">.)</w:t>
+        <w:t xml:space="preserve"> </w:t>
+      </w:r>
+      <w:r>
+        <w:t xml:space="preserve">per Constitution §5 / §12.10.)</w:t>
       </w:r>
     </w:p>
     <w:p>
@@ -1678,66 +1160,26 @@
         </w:pict>
       </w:r>
     </w:p>
+    <w:p>
+      <w:pPr>
+        <w:pStyle w:val="FirstParagraph"/>
+      </w:pPr>
+      <w:r>
+        <w:rPr>
+          <w:b/>
+          <w:bCs/>
+        </w:rPr>
+        <w:t xml:space="preserve">Last reviewed:</w:t>
+      </w:r>
+      <w:r>
+        <w:t xml:space="preserve"> </w:t>
+      </w:r>
+      <w:r>
+        <w:t xml:space="preserve">2026-05-22 (v1.0.14 cycle — clipboard physical-proof landing + multi-host deploy; opened B3 to track the pre-existing v1.0.9 P5-M20+P5-M21 layer-4 escapes transparently).</w:t>
+      </w:r>
+    </w:p>
     <w:bookmarkEnd w:id="15"/>
-    <w:bookmarkStart w:id="16" w:name="e-documentation--continuation-drift"/>
-    <w:p>
-      <w:pPr>
-        <w:pStyle w:val="Heading2"/>
-      </w:pPr>
-      <w:r>
-        <w:t xml:space="preserve">E. Documentation / Continuation drift</w:t>
-      </w:r>
-    </w:p>
-    <w:p>
-      <w:pPr>
-        <w:pStyle w:val="FirstParagraph"/>
-      </w:pPr>
-      <w:r>
-        <w:t xml:space="preserve">(none open at this time; CONTINUATION.md §3 entries that resolve land in</w:t>
-      </w:r>
-      <w:r>
-        <w:t xml:space="preserve"> </w:t>
-      </w:r>
-      <w:r>
-        <w:rPr>
-          <w:rStyle w:val="VerbatimChar"/>
-        </w:rPr>
-        <w:t xml:space="preserve">Fixed.md</w:t>
-      </w:r>
-      <w:r>
-        <w:t xml:space="preserve"> </w:t>
-      </w:r>
-      <w:r>
-        <w:t xml:space="preserve">per Constitution §5 / §12.10.)</w:t>
-      </w:r>
-    </w:p>
-    <w:p>
-      <w:r>
-        <w:pict>
-          <v:rect style="width:0;height:1.5pt" o:hralign="center" o:hrstd="t" o:hr="t"/>
-        </w:pict>
-      </w:r>
-    </w:p>
-    <w:p>
-      <w:pPr>
-        <w:pStyle w:val="FirstParagraph"/>
-      </w:pPr>
-      <w:r>
-        <w:rPr>
-          <w:b/>
-          <w:bCs/>
-        </w:rPr>
-        <w:t xml:space="preserve">Last reviewed:</w:t>
-      </w:r>
-      <w:r>
-        <w:t xml:space="preserve"> </w:t>
-      </w:r>
-      <w:r>
-        <w:t xml:space="preserve">2026-05-22 (v1.0.14 cycle — clipboard physical-proof landing + multi-host deploy; opened B3 to track the pre-existing v1.0.9 P5-M20+P5-M21 layer-4 escapes transparently).</w:t>
-      </w:r>
-    </w:p>
     <w:bookmarkEnd w:id="16"/>
-    <w:bookmarkEnd w:id="17"/>
     <w:sectPr>
       <w:footnotePr>
         <w:numRestart w:val="eachSect"/>
@@ -1958,9 +1400,6 @@
     <w:abstractNumId w:val="991"/>
   </w:num>
   <w:num w:numId="1002">
-    <w:abstractNumId w:val="991"/>
-  </w:num>
-  <w:num w:numId="1003">
     <w:abstractNumId w:val="991"/>
   </w:num>
 </w:numbering>

</xml_diff>

<commit_message>
issues(§11.4.4): track 2 minor robustness Tasks from v1.0.25 cycle (A2 run_all native-resolve, D2 /tmp-hardcode disk-pressure)
Honest backlog (§11.4.4 discovered→tracked, §11.4.148 integrity): two environment/tooling
robustness gaps surfaced during v1.0.25 validation, neither a product defect (tmux + all
feature tests pass normally on both hosts):
- A2 RUNALL-NATIVE-RESOLVE-001 (Queued/Task): standalone run_all.sh is the containerized-
  build validator; on native macOS it can resolve the wrong-arch build dir (use setup.sh).
- D2 TMPDIR-HARDCODE-001 (Queued/Task): tests hardcoding /tmp false-FAIL under host
  disk-full instead of SKIP-with-reason (§11.4.3); should use $TMPDIR / guard writability.
Issues siblings regenerated. Does not change the released v1.0.25 build.

Co-Authored-By: Claude Opus 4.8 <noreply@anthropic.com>
Signed-off-by: Milos Vasic <i@mvasic.ru>
</commit_message>
<xml_diff>
--- a/Issues.docx
+++ b/Issues.docx
@@ -10,7 +10,7 @@
         <w:t xml:space="preserve">Issues</w:t>
       </w:r>
     </w:p>
-    <w:bookmarkStart w:id="17" w:name="vasic-digital-tmux--open-issues-tracker"/>
+    <w:bookmarkStart w:id="19" w:name="vasic-digital-tmux--open-issues-tracker"/>
     <w:p>
       <w:pPr>
         <w:pStyle w:val="Heading1"/>
@@ -934,7 +934,7 @@
       </w:r>
     </w:p>
     <w:bookmarkEnd w:id="10"/>
-    <w:bookmarkStart w:id="11" w:name="a-tooling--harness-gaps"/>
+    <w:bookmarkStart w:id="12" w:name="a-tooling--harness-gaps"/>
     <w:p>
       <w:pPr>
         <w:pStyle w:val="Heading2"/>
@@ -943,24 +943,298 @@
         <w:t xml:space="preserve">A. Tooling / harness gaps</w:t>
       </w:r>
     </w:p>
+    <w:bookmarkStart w:id="11" w:name="X7112ba3800406898baca36fb0edec2c59ef97a0"/>
+    <w:p>
+      <w:pPr>
+        <w:pStyle w:val="Heading3"/>
+      </w:pPr>
+      <w:r>
+        <w:t xml:space="preserve">A2 RUNALL-NATIVE-RESOLVE-001 — standalone run_all.sh mis-resolves the binary on native macOS</w:t>
+      </w:r>
+    </w:p>
     <w:p>
       <w:pPr>
         <w:pStyle w:val="FirstParagraph"/>
       </w:pPr>
       <w:r>
-        <w:t xml:space="preserve">(none open at this time — A1 META-MUT-001 landed in</w:t>
-      </w:r>
-      <w:r>
-        <w:t xml:space="preserve"> </w:t>
-      </w:r>
-      <w:r>
-        <w:rPr>
-          <w:rStyle w:val="VerbatimChar"/>
-        </w:rPr>
-        <w:t xml:space="preserve">Fixed.md</w:t>
-      </w:r>
-      <w:r>
-        <w:t xml:space="preserve">.)</w:t>
+        <w:rPr>
+          <w:b/>
+          <w:bCs/>
+        </w:rPr>
+        <w:t xml:space="preserve">Status:</w:t>
+      </w:r>
+      <w:r>
+        <w:t xml:space="preserve"> </w:t>
+      </w:r>
+      <w:r>
+        <w:t xml:space="preserve">Queued</w:t>
+      </w:r>
+      <w:r>
+        <w:t xml:space="preserve"> </w:t>
+      </w:r>
+      <w:r>
+        <w:rPr>
+          <w:b/>
+          <w:bCs/>
+        </w:rPr>
+        <w:t xml:space="preserve">Type:</w:t>
+      </w:r>
+      <w:r>
+        <w:t xml:space="preserve"> </w:t>
+      </w:r>
+      <w:r>
+        <w:t xml:space="preserve">Task</w:t>
+      </w:r>
+    </w:p>
+    <w:p>
+      <w:pPr>
+        <w:pStyle w:val="BodyText"/>
+      </w:pPr>
+      <w:r>
+        <w:rPr>
+          <w:rStyle w:val="VerbatimChar"/>
+        </w:rPr>
+        <w:t xml:space="preserve">scripts/tests/run_all.sh</w:t>
+      </w:r>
+      <w:r>
+        <w:t xml:space="preserve"> </w:t>
+      </w:r>
+      <w:r>
+        <w:t xml:space="preserve">hardcodes</w:t>
+      </w:r>
+      <w:r>
+        <w:t xml:space="preserve"> </w:t>
+      </w:r>
+      <w:r>
+        <w:rPr>
+          <w:rStyle w:val="VerbatimChar"/>
+        </w:rPr>
+        <w:t xml:space="preserve">TMUX_BIN=tmux/build/bin/tmux</w:t>
+      </w:r>
+      <w:r>
+        <w:t xml:space="preserve"> </w:t>
+      </w:r>
+      <w:r>
+        <w:t xml:space="preserve">(the</w:t>
+      </w:r>
+      <w:r>
+        <w:t xml:space="preserve"> </w:t>
+      </w:r>
+      <w:r>
+        <w:rPr>
+          <w:rStyle w:val="VerbatimChar"/>
+        </w:rPr>
+        <w:t xml:space="preserve">build_containerized.sh</w:t>
+      </w:r>
+      <w:r>
+        <w:t xml:space="preserve"> </w:t>
+      </w:r>
+      <w:r>
+        <w:t xml:space="preserve">output path) and is the containerized-build validator. On</w:t>
+      </w:r>
+      <w:r>
+        <w:t xml:space="preserve"> </w:t>
+      </w:r>
+      <w:r>
+        <w:t xml:space="preserve">native macOS the authoritative validator is</w:t>
+      </w:r>
+      <w:r>
+        <w:t xml:space="preserve"> </w:t>
+      </w:r>
+      <w:r>
+        <w:rPr>
+          <w:rStyle w:val="VerbatimChar"/>
+        </w:rPr>
+        <w:t xml:space="preserve">setup.sh</w:t>
+      </w:r>
+      <w:r>
+        <w:t xml:space="preserve"> </w:t>
+      </w:r>
+      <w:r>
+        <w:t xml:space="preserve">(builds + verifies against</w:t>
+      </w:r>
+      <w:r>
+        <w:t xml:space="preserve"> </w:t>
+      </w:r>
+      <w:r>
+        <w:rPr>
+          <w:rStyle w:val="VerbatimChar"/>
+        </w:rPr>
+        <w:t xml:space="preserve">tmux/build-darwin/</w:t>
+      </w:r>
+      <w:r>
+        <w:t xml:space="preserve">). Invoked standalone on macOS with a stale</w:t>
+      </w:r>
+      <w:r>
+        <w:t xml:space="preserve"> </w:t>
+      </w:r>
+      <w:r>
+        <w:rPr>
+          <w:rStyle w:val="VerbatimChar"/>
+        </w:rPr>
+        <w:t xml:space="preserve">tmux/build/</w:t>
+      </w:r>
+      <w:r>
+        <w:t xml:space="preserve"> </w:t>
+      </w:r>
+      <w:r>
+        <w:t xml:space="preserve">present</w:t>
+      </w:r>
+      <w:r>
+        <w:t xml:space="preserve"> </w:t>
+      </w:r>
+      <w:r>
+        <w:t xml:space="preserve">(a prior Linux containerized build), run_all.sh resolved the wrong-arch binary →</w:t>
+      </w:r>
+      <w:r>
+        <w:t xml:space="preserve"> </w:t>
+      </w:r>
+      <w:r>
+        <w:rPr>
+          <w:rStyle w:val="VerbatimChar"/>
+        </w:rPr>
+        <w:t xml:space="preserve">Exec format error</w:t>
+      </w:r>
+      <w:r>
+        <w:t xml:space="preserve"> </w:t>
+      </w:r>
+      <w:r>
+        <w:t xml:space="preserve">mass-FAIL (observed 2026-06-16; NOT a product defect —</w:t>
+      </w:r>
+      <w:r>
+        <w:t xml:space="preserve"> </w:t>
+      </w:r>
+      <w:r>
+        <w:rPr>
+          <w:rStyle w:val="VerbatimChar"/>
+        </w:rPr>
+        <w:t xml:space="preserve">setup.sh</w:t>
+      </w:r>
+      <w:r>
+        <w:t xml:space="preserve"> </w:t>
+      </w:r>
+      <w:r>
+        <w:t xml:space="preserve">run_all</w:t>
+      </w:r>
+      <w:r>
+        <w:t xml:space="preserve"> </w:t>
+      </w:r>
+      <w:r>
+        <w:rPr>
+          <w:rStyle w:val="VerbatimChar"/>
+        </w:rPr>
+        <w:t xml:space="preserve">55/0/6</w:t>
+      </w:r>
+      <w:r>
+        <w:t xml:space="preserve"> </w:t>
+      </w:r>
+      <w:r>
+        <w:t xml:space="preserve">+ installed-binary smoke GREEN the same session; removing the stale</w:t>
+      </w:r>
+      <w:r>
+        <w:t xml:space="preserve"> </w:t>
+      </w:r>
+      <w:r>
+        <w:rPr>
+          <w:rStyle w:val="VerbatimChar"/>
+        </w:rPr>
+        <w:t xml:space="preserve">tmux/build/</w:t>
+      </w:r>
+      <w:r>
+        <w:t xml:space="preserve"> </w:t>
+      </w:r>
+      <w:r>
+        <w:t xml:space="preserve">then gave</w:t>
+      </w:r>
+      <w:r>
+        <w:t xml:space="preserve"> </w:t>
+      </w:r>
+      <w:r>
+        <w:rPr>
+          <w:rStyle w:val="VerbatimChar"/>
+        </w:rPr>
+        <w:t xml:space="preserve">not executable</w:t>
+      </w:r>
+      <w:r>
+        <w:t xml:space="preserve"> </w:t>
+      </w:r>
+      <w:r>
+        <w:t xml:space="preserve">because run_all expects that path).</w:t>
+      </w:r>
+      <w:r>
+        <w:t xml:space="preserve"> </w:t>
+      </w:r>
+      <w:r>
+        <w:rPr>
+          <w:b/>
+          <w:bCs/>
+        </w:rPr>
+        <w:t xml:space="preserve">Fix</w:t>
+      </w:r>
+      <w:r>
+        <w:rPr>
+          <w:b/>
+          <w:bCs/>
+        </w:rPr>
+        <w:t xml:space="preserve"> </w:t>
+      </w:r>
+      <w:r>
+        <w:rPr>
+          <w:b/>
+          <w:bCs/>
+        </w:rPr>
+        <w:t xml:space="preserve">direction:</w:t>
+      </w:r>
+      <w:r>
+        <w:t xml:space="preserve"> </w:t>
+      </w:r>
+      <w:r>
+        <w:t xml:space="preserve">make run_all.sh OS-aware (prefer</w:t>
+      </w:r>
+      <w:r>
+        <w:t xml:space="preserve"> </w:t>
+      </w:r>
+      <w:r>
+        <w:rPr>
+          <w:rStyle w:val="VerbatimChar"/>
+        </w:rPr>
+        <w:t xml:space="preserve">tmux/build-darwin/</w:t>
+      </w:r>
+      <w:r>
+        <w:t xml:space="preserve"> </w:t>
+      </w:r>
+      <w:r>
+        <w:t xml:space="preserve">on Darwin) OR</w:t>
+      </w:r>
+      <w:r>
+        <w:t xml:space="preserve"> </w:t>
+      </w:r>
+      <w:r>
+        <w:t xml:space="preserve">document that native-macOS validation is</w:t>
+      </w:r>
+      <w:r>
+        <w:t xml:space="preserve"> </w:t>
+      </w:r>
+      <w:r>
+        <w:rPr>
+          <w:rStyle w:val="VerbatimChar"/>
+        </w:rPr>
+        <w:t xml:space="preserve">setup.sh</w:t>
+      </w:r>
+      <w:r>
+        <w:t xml:space="preserve">-only and run_all.sh is the</w:t>
+      </w:r>
+      <w:r>
+        <w:t xml:space="preserve"> </w:t>
+      </w:r>
+      <w:r>
+        <w:t xml:space="preserve">containerized path. Captured-evidence requirement: a clean native-macOS run_all GREEN</w:t>
+      </w:r>
+      <w:r>
+        <w:t xml:space="preserve"> </w:t>
+      </w:r>
+      <w:r>
+        <w:t xml:space="preserve">after the fix.</w:t>
       </w:r>
     </w:p>
     <w:p>
@@ -971,7 +1245,8 @@
       </w:r>
     </w:p>
     <w:bookmarkEnd w:id="11"/>
-    <w:bookmarkStart w:id="12" w:name="Xb86f81d76618d54881eaba1753a4cb72beb54ce"/>
+    <w:bookmarkEnd w:id="12"/>
+    <w:bookmarkStart w:id="13" w:name="Xb86f81d76618d54881eaba1753a4cb72beb54ce"/>
     <w:p>
       <w:pPr>
         <w:pStyle w:val="Heading2"/>
@@ -1046,8 +1321,8 @@
         </w:pict>
       </w:r>
     </w:p>
-    <w:bookmarkEnd w:id="12"/>
-    <w:bookmarkStart w:id="13" w:name="X274f73d5acf258963b31ff7c75a674bee0e935e"/>
+    <w:bookmarkEnd w:id="13"/>
+    <w:bookmarkStart w:id="14" w:name="X274f73d5acf258963b31ff7c75a674bee0e935e"/>
     <w:p>
       <w:pPr>
         <w:pStyle w:val="Heading2"/>
@@ -1083,8 +1358,8 @@
         </w:pict>
       </w:r>
     </w:p>
-    <w:bookmarkEnd w:id="13"/>
-    <w:bookmarkStart w:id="14" w:name="X9125c2495937530f0e64223858a8a5d6a10e5bd"/>
+    <w:bookmarkEnd w:id="14"/>
+    <w:bookmarkStart w:id="16" w:name="X9125c2495937530f0e64223858a8a5d6a10e5bd"/>
     <w:p>
       <w:pPr>
         <w:pStyle w:val="Heading2"/>
@@ -1093,24 +1368,284 @@
         <w:t xml:space="preserve">D. Host-capability + topology dispatch gaps</w:t>
       </w:r>
     </w:p>
+    <w:bookmarkStart w:id="15" w:name="X5e199cf37a7d6ff0313698f63b14d62e1213353"/>
+    <w:p>
+      <w:pPr>
+        <w:pStyle w:val="Heading3"/>
+      </w:pPr>
+      <w:r>
+        <w:t xml:space="preserve">D2 TMPDIR-HARDCODE-001 — tests hardcoding /tmp false-FAIL under host disk-pressure</w:t>
+      </w:r>
+    </w:p>
     <w:p>
       <w:pPr>
         <w:pStyle w:val="FirstParagraph"/>
       </w:pPr>
       <w:r>
-        <w:t xml:space="preserve">(none open at this time — D1 TOPO-DISPATCH-001 landed in</w:t>
-      </w:r>
-      <w:r>
-        <w:t xml:space="preserve"> </w:t>
-      </w:r>
-      <w:r>
-        <w:rPr>
-          <w:rStyle w:val="VerbatimChar"/>
-        </w:rPr>
-        <w:t xml:space="preserve">Fixed.md</w:t>
-      </w:r>
-      <w:r>
-        <w:t xml:space="preserve">.)</w:t>
+        <w:rPr>
+          <w:b/>
+          <w:bCs/>
+        </w:rPr>
+        <w:t xml:space="preserve">Status:</w:t>
+      </w:r>
+      <w:r>
+        <w:t xml:space="preserve"> </w:t>
+      </w:r>
+      <w:r>
+        <w:t xml:space="preserve">Queued</w:t>
+      </w:r>
+      <w:r>
+        <w:t xml:space="preserve"> </w:t>
+      </w:r>
+      <w:r>
+        <w:rPr>
+          <w:b/>
+          <w:bCs/>
+        </w:rPr>
+        <w:t xml:space="preserve">Type:</w:t>
+      </w:r>
+      <w:r>
+        <w:t xml:space="preserve"> </w:t>
+      </w:r>
+      <w:r>
+        <w:t xml:space="preserve">Task</w:t>
+      </w:r>
+    </w:p>
+    <w:p>
+      <w:pPr>
+        <w:pStyle w:val="BodyText"/>
+      </w:pPr>
+      <w:r>
+        <w:t xml:space="preserve">Several tests create scratch under a hardcoded</w:t>
+      </w:r>
+      <w:r>
+        <w:t xml:space="preserve"> </w:t>
+      </w:r>
+      <w:r>
+        <w:rPr>
+          <w:rStyle w:val="VerbatimChar"/>
+        </w:rPr>
+        <w:t xml:space="preserve">/tmp</w:t>
+      </w:r>
+      <w:r>
+        <w:t xml:space="preserve"> </w:t>
+      </w:r>
+      <w:r>
+        <w:t xml:space="preserve">(e.g.</w:t>
+      </w:r>
+      <w:r>
+        <w:t xml:space="preserve"> </w:t>
+      </w:r>
+      <w:r>
+        <w:rPr>
+          <w:rStyle w:val="VerbatimChar"/>
+        </w:rPr>
+        <w:t xml:space="preserve">27_state_persistence.sh</w:t>
+      </w:r>
+      <w:r>
+        <w:t xml:space="preserve"> </w:t>
+      </w:r>
+      <w:r>
+        <w:t xml:space="preserve">target</w:t>
+      </w:r>
+      <w:r>
+        <w:t xml:space="preserve"> </w:t>
+      </w:r>
+      <w:r>
+        <w:rPr>
+          <w:rStyle w:val="VerbatimChar"/>
+        </w:rPr>
+        <w:t xml:space="preserve">tmx-test-18-target-*</w:t>
+      </w:r>
+      <w:r>
+        <w:t xml:space="preserve">). When the host root volume is full (observed 2026-06-16</w:t>
+      </w:r>
+      <w:r>
+        <w:t xml:space="preserve"> </w:t>
+      </w:r>
+      <w:r>
+        <w:t xml:space="preserve">on macOS,</w:t>
+      </w:r>
+      <w:r>
+        <w:t xml:space="preserve"> </w:t>
+      </w:r>
+      <w:r>
+        <w:rPr>
+          <w:rStyle w:val="VerbatimChar"/>
+        </w:rPr>
+        <w:t xml:space="preserve">/</w:t>
+      </w:r>
+      <w:r>
+        <w:t xml:space="preserve"> </w:t>
+      </w:r>
+      <w:r>
+        <w:t xml:space="preserve">at &lt;200 MiB during the operator's away-window), the</w:t>
+      </w:r>
+      <w:r>
+        <w:t xml:space="preserve"> </w:t>
+      </w:r>
+      <w:r>
+        <w:rPr>
+          <w:rStyle w:val="VerbatimChar"/>
+        </w:rPr>
+        <w:t xml:space="preserve">cd</w:t>
+      </w:r>
+      <w:r>
+        <w:t xml:space="preserve">/mkdir into</w:t>
+      </w:r>
+      <w:r>
+        <w:t xml:space="preserve"> </w:t>
+      </w:r>
+      <w:r>
+        <w:rPr>
+          <w:rStyle w:val="VerbatimChar"/>
+        </w:rPr>
+        <w:t xml:space="preserve">/tmp</w:t>
+      </w:r>
+      <w:r>
+        <w:t xml:space="preserve"> </w:t>
+      </w:r>
+      <w:r>
+        <w:t xml:space="preserve">fails →</w:t>
+      </w:r>
+      <w:r>
+        <w:t xml:space="preserve"> </w:t>
+      </w:r>
+      <w:r>
+        <w:rPr>
+          <w:rStyle w:val="VerbatimChar"/>
+        </w:rPr>
+        <w:t xml:space="preserve">pane_current_path=''</w:t>
+      </w:r>
+      <w:r>
+        <w:t xml:space="preserve"> </w:t>
+      </w:r>
+      <w:r>
+        <w:t xml:space="preserve">false-FAIL instead of an honest §11.4.3 SKIP-with-reason.</w:t>
+      </w:r>
+      <w:r>
+        <w:t xml:space="preserve"> </w:t>
+      </w:r>
+      <w:r>
+        <w:t xml:space="preserve">The tests pass normally + standalone (27</w:t>
+      </w:r>
+      <w:r>
+        <w:t xml:space="preserve"> </w:t>
+      </w:r>
+      <w:r>
+        <w:rPr>
+          <w:rStyle w:val="VerbatimChar"/>
+        </w:rPr>
+        <w:t xml:space="preserve">3/3</w:t>
+      </w:r>
+      <w:r>
+        <w:t xml:space="preserve">, 38</w:t>
+      </w:r>
+      <w:r>
+        <w:t xml:space="preserve"> </w:t>
+      </w:r>
+      <w:r>
+        <w:rPr>
+          <w:rStyle w:val="VerbatimChar"/>
+        </w:rPr>
+        <w:t xml:space="preserve">3/3</w:t>
+      </w:r>
+      <w:r>
+        <w:t xml:space="preserve">, 43</w:t>
+      </w:r>
+      <w:r>
+        <w:t xml:space="preserve"> </w:t>
+      </w:r>
+      <w:r>
+        <w:rPr>
+          <w:rStyle w:val="VerbatimChar"/>
+        </w:rPr>
+        <w:t xml:space="preserve">15/0</w:t>
+      </w:r>
+      <w:r>
+        <w:t xml:space="preserve"> </w:t>
+      </w:r>
+      <w:r>
+        <w:t xml:space="preserve">re-run the same</w:t>
+      </w:r>
+      <w:r>
+        <w:t xml:space="preserve"> </w:t>
+      </w:r>
+      <w:r>
+        <w:t xml:space="preserve">session) — the failure is purely the abnormal host-disk condition (a §11.4.1 FAIL-bluff</w:t>
+      </w:r>
+      <w:r>
+        <w:t xml:space="preserve"> </w:t>
+      </w:r>
+      <w:r>
+        <w:t xml:space="preserve">class: environment, not product).</w:t>
+      </w:r>
+      <w:r>
+        <w:t xml:space="preserve"> </w:t>
+      </w:r>
+      <w:r>
+        <w:rPr>
+          <w:b/>
+          <w:bCs/>
+        </w:rPr>
+        <w:t xml:space="preserve">Fix direction:</w:t>
+      </w:r>
+      <w:r>
+        <w:t xml:space="preserve"> </w:t>
+      </w:r>
+      <w:r>
+        <w:t xml:space="preserve">route test scratch through</w:t>
+      </w:r>
+      <w:r>
+        <w:t xml:space="preserve"> </w:t>
+      </w:r>
+      <w:r>
+        <w:rPr>
+          <w:rStyle w:val="VerbatimChar"/>
+        </w:rPr>
+        <w:t xml:space="preserve">$TMPDIR</w:t>
+      </w:r>
+      <w:r>
+        <w:t xml:space="preserve"> </w:t>
+      </w:r>
+      <w:r>
+        <w:t xml:space="preserve">(operator now sets</w:t>
+      </w:r>
+      <w:r>
+        <w:t xml:space="preserve"> </w:t>
+      </w:r>
+      <w:r>
+        <w:rPr>
+          <w:rStyle w:val="VerbatimChar"/>
+        </w:rPr>
+        <w:t xml:space="preserve">/Volumes/T7/tmp</w:t>
+      </w:r>
+      <w:r>
+        <w:t xml:space="preserve"> </w:t>
+      </w:r>
+      <w:r>
+        <w:t xml:space="preserve">via ~/.zshrc + ~/.bashrc) OR guard each test on</w:t>
+      </w:r>
+      <w:r>
+        <w:t xml:space="preserve"> </w:t>
+      </w:r>
+      <w:r>
+        <w:rPr>
+          <w:rStyle w:val="VerbatimChar"/>
+        </w:rPr>
+        <w:t xml:space="preserve">/tmp</w:t>
+      </w:r>
+      <w:r>
+        <w:t xml:space="preserve"> </w:t>
+      </w:r>
+      <w:r>
+        <w:t xml:space="preserve">writability and SKIP-with-reason (§11.4.3/§11.4.50). Captured-evidence requirement:</w:t>
+      </w:r>
+      <w:r>
+        <w:t xml:space="preserve"> </w:t>
+      </w:r>
+      <w:r>
+        <w:t xml:space="preserve">an induced-disk-full run shows SKIP-with-reason, not FAIL.</w:t>
       </w:r>
     </w:p>
     <w:p>
@@ -1120,8 +1655,9 @@
         </w:pict>
       </w:r>
     </w:p>
-    <w:bookmarkEnd w:id="14"/>
-    <w:bookmarkStart w:id="15" w:name="e-documentation--continuation-drift"/>
+    <w:bookmarkEnd w:id="15"/>
+    <w:bookmarkEnd w:id="16"/>
+    <w:bookmarkStart w:id="17" w:name="e-documentation--continuation-drift"/>
     <w:p>
       <w:pPr>
         <w:pStyle w:val="Heading2"/>
@@ -1160,8 +1696,8 @@
         </w:pict>
       </w:r>
     </w:p>
-    <w:bookmarkEnd w:id="15"/>
-    <w:bookmarkStart w:id="16" w:name="X250669e1b3e4eec2b5ccf8718eb9d17180ea6b1"/>
+    <w:bookmarkEnd w:id="17"/>
+    <w:bookmarkStart w:id="18" w:name="X250669e1b3e4eec2b5ccf8718eb9d17180ea6b1"/>
     <w:p>
       <w:pPr>
         <w:pStyle w:val="Heading2"/>
@@ -1287,7 +1823,7 @@
         <w:t xml:space="preserve"> </w:t>
       </w:r>
       <w:r>
-        <w:t xml:space="preserve">2026-06-13 (F1 HelixCode terminal-crash RESOLVED + closed to</w:t>
+        <w:t xml:space="preserve">2026-06-17 (v1.0.25 RELEASED; A49 test-17 flake closed to</w:t>
       </w:r>
       <w:r>
         <w:t xml:space="preserve"> </w:t>
@@ -1299,14 +1835,41 @@
         <w:t xml:space="preserve">Fixed.md</w:t>
       </w:r>
       <w:r>
-        <w:t xml:space="preserve"> </w:t>
-      </w:r>
-      <w:r>
-        <w:t xml:space="preserve">A45 with reproduced root cause + 4-layer regression guard; operator-confirmed "works now". Zero open non-terminal items.)</w:t>
-      </w:r>
-    </w:p>
-    <w:bookmarkEnd w:id="16"/>
-    <w:bookmarkEnd w:id="17"/>
+        <w:t xml:space="preserve">.</w:t>
+      </w:r>
+      <w:r>
+        <w:t xml:space="preserve"> </w:t>
+      </w:r>
+      <w:r>
+        <w:t xml:space="preserve">Two minor Queued robustness Tasks added from the v1.0.25 cycle: A2 RUNALL-NATIVE-RESOLVE-001</w:t>
+      </w:r>
+      <w:r>
+        <w:t xml:space="preserve"> </w:t>
+      </w:r>
+      <w:r>
+        <w:t xml:space="preserve">[run_all.sh containerized-path vs native-macOS binary resolution] + D2 TMPDIR-HARDCODE-001</w:t>
+      </w:r>
+      <w:r>
+        <w:t xml:space="preserve"> </w:t>
+      </w:r>
+      <w:r>
+        <w:t xml:space="preserve">[tests hardcoding /tmp false-FAIL under host disk-pressure → should SKIP-with-reason / use</w:t>
+      </w:r>
+      <w:r>
+        <w:t xml:space="preserve"> </w:t>
+      </w:r>
+      <w:r>
+        <w:t xml:space="preserve">$TMPDIR]. Both are environment/tooling robustness gaps, NOT product defects — the tmux</w:t>
+      </w:r>
+      <w:r>
+        <w:t xml:space="preserve"> </w:t>
+      </w:r>
+      <w:r>
+        <w:t xml:space="preserve">product + all feature tests pass normally on both hosts.)</w:t>
+      </w:r>
+    </w:p>
+    <w:bookmarkEnd w:id="18"/>
+    <w:bookmarkEnd w:id="19"/>
     <w:sectPr>
       <w:footnotePr>
         <w:numRestart w:val="eachSect"/>

</xml_diff>

<commit_message>
docs(§11.4.65): regenerate stale HTML/PDF/DOCX exports post-v1.0.31
Mechanical pandoc/weasyprint re-export of already-committed Markdown so every
.md carries fresh siblings (§11.4.65/§11.4.60): CHANGELOG (the v1.0.31 entry),
Issues/README/Constitution/docs-scripts-install + new troubleshooting + qa/
research READMEs. Derived artifacts only — no source change.

Co-Authored-By: Claude Opus 4.8 (1M context) <noreply@anthropic.com>
Signed-off-by: Милош Васић <milos85vasic@gmail.com>
</commit_message>
<xml_diff>
--- a/Issues.docx
+++ b/Issues.docx
@@ -10,7 +10,7 @@
         <w:t xml:space="preserve">Issues</w:t>
       </w:r>
     </w:p>
-    <w:bookmarkStart w:id="20" w:name="vasic-digital-tmux--open-issues-tracker"/>
+    <w:bookmarkStart w:id="30" w:name="vasic-digital-tmux--open-issues-tracker"/>
     <w:p>
       <w:pPr>
         <w:pStyle w:val="Heading1"/>
@@ -934,7 +934,7 @@
       </w:r>
     </w:p>
     <w:bookmarkEnd w:id="10"/>
-    <w:bookmarkStart w:id="12" w:name="a-tooling--harness-gaps"/>
+    <w:bookmarkStart w:id="17" w:name="a-tooling--harness-gaps"/>
     <w:p>
       <w:pPr>
         <w:pStyle w:val="Heading2"/>
@@ -1241,6 +1241,1187 @@
       </w:r>
       <w:r>
         <w:t xml:space="preserve">after the fix.</w:t>
+      </w:r>
+    </w:p>
+    <w:bookmarkEnd w:id="11"/>
+    <w:bookmarkStart w:id="12" w:name="X7f3d974dc648b4929ffa68d45bc018ab08f84dd"/>
+    <w:p>
+      <w:pPr>
+        <w:pStyle w:val="Heading3"/>
+      </w:pPr>
+      <w:r>
+        <w:t xml:space="preserve">A50 GO-TOOLCHAIN-OBTAIN-001 — obtain Go toolchain locally for the tmx-state + workable-items Go build —</w:t>
+      </w:r>
+      <w:r>
+        <w:t xml:space="preserve"> </w:t>
+      </w:r>
+      <w:r>
+        <w:rPr>
+          <w:rStyle w:val="VerbatimChar"/>
+        </w:rPr>
+        <w:t xml:space="preserve">OPEN</w:t>
+      </w:r>
+    </w:p>
+    <w:p>
+      <w:pPr>
+        <w:pStyle w:val="FirstParagraph"/>
+      </w:pPr>
+      <w:r>
+        <w:rPr>
+          <w:b/>
+          <w:bCs/>
+        </w:rPr>
+        <w:t xml:space="preserve">TMX-ID:</w:t>
+      </w:r>
+      <w:r>
+        <w:t xml:space="preserve"> </w:t>
+      </w:r>
+      <w:r>
+        <w:t xml:space="preserve">TMX-057</w:t>
+      </w:r>
+      <w:r>
+        <w:t xml:space="preserve"> </w:t>
+      </w:r>
+      <w:r>
+        <w:rPr>
+          <w:b/>
+          <w:bCs/>
+        </w:rPr>
+        <w:t xml:space="preserve">Status:</w:t>
+      </w:r>
+      <w:r>
+        <w:t xml:space="preserve"> </w:t>
+      </w:r>
+      <w:r>
+        <w:rPr>
+          <w:rStyle w:val="VerbatimChar"/>
+        </w:rPr>
+        <w:t xml:space="preserve">OPEN</w:t>
+      </w:r>
+      <w:r>
+        <w:t xml:space="preserve"> </w:t>
+      </w:r>
+      <w:r>
+        <w:rPr>
+          <w:b/>
+          <w:bCs/>
+        </w:rPr>
+        <w:t xml:space="preserve">Type:</w:t>
+      </w:r>
+      <w:r>
+        <w:t xml:space="preserve"> </w:t>
+      </w:r>
+      <w:r>
+        <w:t xml:space="preserve">Task</w:t>
+      </w:r>
+      <w:r>
+        <w:t xml:space="preserve"> </w:t>
+      </w:r>
+      <w:r>
+        <w:rPr>
+          <w:b/>
+          <w:bCs/>
+        </w:rPr>
+        <w:t xml:space="preserve">Severity:</w:t>
+      </w:r>
+      <w:r>
+        <w:t xml:space="preserve"> </w:t>
+      </w:r>
+      <w:r>
+        <w:t xml:space="preserve">MEDIUM</w:t>
+      </w:r>
+    </w:p>
+    <w:p>
+      <w:pPr>
+        <w:pStyle w:val="BodyText"/>
+      </w:pPr>
+      <w:r>
+        <w:t xml:space="preserve">On hosts lacking a system Go toolchain (e.g.</w:t>
+      </w:r>
+      <w:r>
+        <w:t xml:space="preserve"> </w:t>
+      </w:r>
+      <w:r>
+        <w:rPr>
+          <w:rStyle w:val="VerbatimChar"/>
+        </w:rPr>
+        <w:t xml:space="preserve">amber</w:t>
+      </w:r>
+      <w:r>
+        <w:t xml:space="preserve">), the</w:t>
+      </w:r>
+      <w:r>
+        <w:t xml:space="preserve"> </w:t>
+      </w:r>
+      <w:r>
+        <w:rPr>
+          <w:rStyle w:val="VerbatimChar"/>
+        </w:rPr>
+        <w:t xml:space="preserve">scripts/tmx-state/</w:t>
+      </w:r>
+      <w:r>
+        <w:t xml:space="preserve"> </w:t>
+      </w:r>
+      <w:r>
+        <w:t xml:space="preserve">and</w:t>
+      </w:r>
+      <w:r>
+        <w:t xml:space="preserve"> </w:t>
+      </w:r>
+      <w:r>
+        <w:rPr>
+          <w:rStyle w:val="VerbatimChar"/>
+        </w:rPr>
+        <w:t xml:space="preserve">cmd/workable-items/</w:t>
+      </w:r>
+      <w:r>
+        <w:t xml:space="preserve"> </w:t>
+      </w:r>
+      <w:r>
+        <w:t xml:space="preserve">Go binaries cannot be (re)built — blocking per-session cwd</w:t>
+      </w:r>
+      <w:r>
+        <w:t xml:space="preserve"> </w:t>
+      </w:r>
+      <w:r>
+        <w:t xml:space="preserve">persistence AND the §11.4.93 workable-items SSoT tooling.</w:t>
+      </w:r>
+      <w:r>
+        <w:t xml:space="preserve"> </w:t>
+      </w:r>
+      <w:r>
+        <w:rPr>
+          <w:b/>
+          <w:bCs/>
+        </w:rPr>
+        <w:t xml:space="preserve">Fix direction:</w:t>
+      </w:r>
+      <w:r>
+        <w:t xml:space="preserve"> </w:t>
+      </w:r>
+      <w:r>
+        <w:t xml:space="preserve">extend the</w:t>
+      </w:r>
+      <w:r>
+        <w:t xml:space="preserve"> </w:t>
+      </w:r>
+      <w:r>
+        <w:t xml:space="preserve">existing §11.4.77 local-deps mechanism (</w:t>
+      </w:r>
+      <w:r>
+        <w:rPr>
+          <w:rStyle w:val="VerbatimChar"/>
+        </w:rPr>
+        <w:t xml:space="preserve">obtain_local_deps.sh</w:t>
+      </w:r>
+      <w:r>
+        <w:t xml:space="preserve">, which already</w:t>
+      </w:r>
+      <w:r>
+        <w:t xml:space="preserve"> </w:t>
+      </w:r>
+      <w:r>
+        <w:t xml:space="preserve">sha256-obtains libevent 2.1.12 + ncurses 6.5 into git-ignored</w:t>
+      </w:r>
+      <w:r>
+        <w:t xml:space="preserve"> </w:t>
+      </w:r>
+      <w:r>
+        <w:rPr>
+          <w:rStyle w:val="VerbatimChar"/>
+        </w:rPr>
+        <w:t xml:space="preserve">.local-deps/</w:t>
+      </w:r>
+      <w:r>
+        <w:t xml:space="preserve">) to</w:t>
+      </w:r>
+      <w:r>
+        <w:t xml:space="preserve"> </w:t>
+      </w:r>
+      <w:r>
+        <w:t xml:space="preserve">resolve-or-obtain a pinned Go toolchain into</w:t>
+      </w:r>
+      <w:r>
+        <w:t xml:space="preserve"> </w:t>
+      </w:r>
+      <w:r>
+        <w:rPr>
+          <w:rStyle w:val="VerbatimChar"/>
+        </w:rPr>
+        <w:t xml:space="preserve">.local-deps/</w:t>
+      </w:r>
+      <w:r>
+        <w:t xml:space="preserve">, consumed by the Go build</w:t>
+      </w:r>
+      <w:r>
+        <w:t xml:space="preserve"> </w:t>
+      </w:r>
+      <w:r>
+        <w:t xml:space="preserve">steps via</w:t>
+      </w:r>
+      <w:r>
+        <w:t xml:space="preserve"> </w:t>
+      </w:r>
+      <w:r>
+        <w:rPr>
+          <w:rStyle w:val="VerbatimChar"/>
+        </w:rPr>
+        <w:t xml:space="preserve">GOROOT</w:t>
+      </w:r>
+      <w:r>
+        <w:t xml:space="preserve">/</w:t>
+      </w:r>
+      <w:r>
+        <w:rPr>
+          <w:rStyle w:val="VerbatimChar"/>
+        </w:rPr>
+        <w:t xml:space="preserve">PATH</w:t>
+      </w:r>
+      <w:r>
+        <w:t xml:space="preserve">.</w:t>
+      </w:r>
+      <w:r>
+        <w:t xml:space="preserve"> </w:t>
+      </w:r>
+      <w:r>
+        <w:rPr>
+          <w:b/>
+          <w:bCs/>
+        </w:rPr>
+        <w:t xml:space="preserve">Acceptance:</w:t>
+      </w:r>
+      <w:r>
+        <w:t xml:space="preserve"> </w:t>
+      </w:r>
+      <w:r>
+        <w:t xml:space="preserve">on a host with no system</w:t>
+      </w:r>
+      <w:r>
+        <w:t xml:space="preserve"> </w:t>
+      </w:r>
+      <w:r>
+        <w:rPr>
+          <w:rStyle w:val="VerbatimChar"/>
+        </w:rPr>
+        <w:t xml:space="preserve">go</w:t>
+      </w:r>
+      <w:r>
+        <w:t xml:space="preserve">, a clean</w:t>
+      </w:r>
+      <w:r>
+        <w:t xml:space="preserve"> </w:t>
+      </w:r>
+      <w:r>
+        <w:rPr>
+          <w:rStyle w:val="VerbatimChar"/>
+        </w:rPr>
+        <w:t xml:space="preserve">go build ./cmd/workable-items</w:t>
+      </w:r>
+      <w:r>
+        <w:t xml:space="preserve"> </w:t>
+      </w:r>
+      <w:r>
+        <w:t xml:space="preserve">succeeds against the obtained local toolchain (exit 0;</w:t>
+      </w:r>
+      <w:r>
+        <w:t xml:space="preserve"> </w:t>
+      </w:r>
+      <w:r>
+        <w:t xml:space="preserve">control without it →</w:t>
+      </w:r>
+      <w:r>
+        <w:t xml:space="preserve"> </w:t>
+      </w:r>
+      <w:r>
+        <w:rPr>
+          <w:rStyle w:val="VerbatimChar"/>
+        </w:rPr>
+        <w:t xml:space="preserve">go: command not found</w:t>
+      </w:r>
+      <w:r>
+        <w:t xml:space="preserve">).</w:t>
+      </w:r>
+    </w:p>
+    <w:bookmarkEnd w:id="12"/>
+    <w:bookmarkStart w:id="13" w:name="Xfa0db880427aa5a824845b075b11cec46434728"/>
+    <w:p>
+      <w:pPr>
+        <w:pStyle w:val="Heading3"/>
+      </w:pPr>
+      <w:r>
+        <w:t xml:space="preserve">A51 NATIVE-BUILD-CC-LINK-MSG-001 — native-build fallback surfaced a cryptic compiler error instead of an honest, actionable message —</w:t>
+      </w:r>
+      <w:r>
+        <w:t xml:space="preserve"> </w:t>
+      </w:r>
+      <w:r>
+        <w:rPr>
+          <w:rStyle w:val="VerbatimChar"/>
+        </w:rPr>
+        <w:t xml:space="preserve">INVESTIGATED</w:t>
+      </w:r>
+    </w:p>
+    <w:p>
+      <w:pPr>
+        <w:pStyle w:val="FirstParagraph"/>
+      </w:pPr>
+      <w:r>
+        <w:rPr>
+          <w:b/>
+          <w:bCs/>
+        </w:rPr>
+        <w:t xml:space="preserve">TMX-ID:</w:t>
+      </w:r>
+      <w:r>
+        <w:t xml:space="preserve"> </w:t>
+      </w:r>
+      <w:r>
+        <w:t xml:space="preserve">TMX-061</w:t>
+      </w:r>
+      <w:r>
+        <w:t xml:space="preserve"> </w:t>
+      </w:r>
+      <w:r>
+        <w:rPr>
+          <w:b/>
+          <w:bCs/>
+        </w:rPr>
+        <w:t xml:space="preserve">Status:</w:t>
+      </w:r>
+      <w:r>
+        <w:t xml:space="preserve"> </w:t>
+      </w:r>
+      <w:r>
+        <w:rPr>
+          <w:rStyle w:val="VerbatimChar"/>
+        </w:rPr>
+        <w:t xml:space="preserve">Ready for testing</w:t>
+      </w:r>
+      <w:r>
+        <w:t xml:space="preserve"> </w:t>
+      </w:r>
+      <w:r>
+        <w:rPr>
+          <w:b/>
+          <w:bCs/>
+        </w:rPr>
+        <w:t xml:space="preserve">Type:</w:t>
+      </w:r>
+      <w:r>
+        <w:t xml:space="preserve"> </w:t>
+      </w:r>
+      <w:r>
+        <w:t xml:space="preserve">Bug</w:t>
+      </w:r>
+      <w:r>
+        <w:t xml:space="preserve"> </w:t>
+      </w:r>
+      <w:r>
+        <w:rPr>
+          <w:b/>
+          <w:bCs/>
+        </w:rPr>
+        <w:t xml:space="preserve">Severity:</w:t>
+      </w:r>
+      <w:r>
+        <w:t xml:space="preserve"> </w:t>
+      </w:r>
+      <w:r>
+        <w:t xml:space="preserve">HIGH</w:t>
+      </w:r>
+    </w:p>
+    <w:p>
+      <w:pPr>
+        <w:pStyle w:val="BodyText"/>
+      </w:pPr>
+      <w:r>
+        <w:t xml:space="preserve">On a base ALT host where</w:t>
+      </w:r>
+      <w:r>
+        <w:t xml:space="preserve"> </w:t>
+      </w:r>
+      <w:r>
+        <w:rPr>
+          <w:rStyle w:val="VerbatimChar"/>
+        </w:rPr>
+        <w:t xml:space="preserve">gcc</w:t>
+      </w:r>
+      <w:r>
+        <w:t xml:space="preserve"> </w:t>
+      </w:r>
+      <w:r>
+        <w:t xml:space="preserve">is present but cannot link (glibc-devel missing), the</w:t>
+      </w:r>
+      <w:r>
+        <w:t xml:space="preserve"> </w:t>
+      </w:r>
+      <w:r>
+        <w:rPr>
+          <w:rStyle w:val="VerbatimChar"/>
+        </w:rPr>
+        <w:t xml:space="preserve">setup.sh</w:t>
+      </w:r>
+      <w:r>
+        <w:t xml:space="preserve"> </w:t>
+      </w:r>
+      <w:r>
+        <w:t xml:space="preserve">native-build fallback surfaced the raw cryptic autotools error "C compiler cannot create executables" instead of an honest, actionable message — a §11.4.138 operator-escape the green suite missed. FIXED this session:</w:t>
+      </w:r>
+      <w:r>
+        <w:t xml:space="preserve"> </w:t>
+      </w:r>
+      <w:r>
+        <w:rPr>
+          <w:rStyle w:val="VerbatimChar"/>
+        </w:rPr>
+        <w:t xml:space="preserve">setup.sh</w:t>
+      </w:r>
+      <w:r>
+        <w:t xml:space="preserve"> </w:t>
+      </w:r>
+      <w:r>
+        <w:t xml:space="preserve">gains</w:t>
+      </w:r>
+      <w:r>
+        <w:t xml:space="preserve"> </w:t>
+      </w:r>
+      <w:r>
+        <w:rPr>
+          <w:rStyle w:val="VerbatimChar"/>
+        </w:rPr>
+        <w:t xml:space="preserve">cc_can_link</w:t>
+      </w:r>
+      <w:r>
+        <w:t xml:space="preserve"> </w:t>
+      </w:r>
+      <w:r>
+        <w:t xml:space="preserve">+</w:t>
+      </w:r>
+      <w:r>
+        <w:t xml:space="preserve"> </w:t>
+      </w:r>
+      <w:r>
+        <w:rPr>
+          <w:rStyle w:val="VerbatimChar"/>
+        </w:rPr>
+        <w:t xml:space="preserve">_native_build_preflight</w:t>
+      </w:r>
+      <w:r>
+        <w:t xml:space="preserve"> </w:t>
+      </w:r>
+      <w:r>
+        <w:t xml:space="preserve">emitting an honest diagnostic and auto-installing the missing toolchain when running as root, guarded by</w:t>
+      </w:r>
+      <w:r>
+        <w:t xml:space="preserve"> </w:t>
+      </w:r>
+      <w:r>
+        <w:rPr>
+          <w:rStyle w:val="VerbatimChar"/>
+        </w:rPr>
+        <w:t xml:space="preserve">scripts/tests/70</w:t>
+      </w:r>
+      <w:r>
+        <w:t xml:space="preserve"> </w:t>
+      </w:r>
+      <w:r>
+        <w:t xml:space="preserve">(RED→GREEN) with a bluff-audit at</w:t>
+      </w:r>
+      <w:r>
+        <w:t xml:space="preserve"> </w:t>
+      </w:r>
+      <w:r>
+        <w:rPr>
+          <w:rStyle w:val="VerbatimChar"/>
+        </w:rPr>
+        <w:t xml:space="preserve">docs/research/native_fallback_cc_link_bluff_audit/</w:t>
+      </w:r>
+      <w:r>
+        <w:t xml:space="preserve">. Acceptance:</w:t>
+      </w:r>
+      <w:r>
+        <w:t xml:space="preserve"> </w:t>
+      </w:r>
+      <w:r>
+        <w:rPr>
+          <w:rStyle w:val="VerbatimChar"/>
+        </w:rPr>
+        <w:t xml:space="preserve">RED_MODE=1</w:t>
+      </w:r>
+      <w:r>
+        <w:t xml:space="preserve"> </w:t>
+      </w:r>
+      <w:r>
+        <w:t xml:space="preserve">reproduces the cryptic failure on the broken artifact,</w:t>
+      </w:r>
+      <w:r>
+        <w:t xml:space="preserve"> </w:t>
+      </w:r>
+      <w:r>
+        <w:rPr>
+          <w:rStyle w:val="VerbatimChar"/>
+        </w:rPr>
+        <w:t xml:space="preserve">RED_MODE=0</w:t>
+      </w:r>
+      <w:r>
+        <w:t xml:space="preserve"> </w:t>
+      </w:r>
+      <w:r>
+        <w:t xml:space="preserve">is GREEN, and the paired meta-mutation is CAUGHT — verified post-commit on a clean tree (test 70 currently PASS=16/0/0; pending commit + post-commit meta-validation).</w:t>
+      </w:r>
+    </w:p>
+    <w:bookmarkEnd w:id="13"/>
+    <w:bookmarkStart w:id="14" w:name="Xdbeaac06db25647fc617d5bb2bc540217ef12f0"/>
+    <w:p>
+      <w:pPr>
+        <w:pStyle w:val="Heading3"/>
+      </w:pPr>
+      <w:r>
+        <w:t xml:space="preserve">A52 NO-SUDO-NO-INTERACTION-001 — no sudo/su execution and no user-interaction in any automation script or test —</w:t>
+      </w:r>
+      <w:r>
+        <w:t xml:space="preserve"> </w:t>
+      </w:r>
+      <w:r>
+        <w:rPr>
+          <w:rStyle w:val="VerbatimChar"/>
+        </w:rPr>
+        <w:t xml:space="preserve">INVESTIGATED</w:t>
+      </w:r>
+    </w:p>
+    <w:p>
+      <w:pPr>
+        <w:pStyle w:val="FirstParagraph"/>
+      </w:pPr>
+      <w:r>
+        <w:rPr>
+          <w:b/>
+          <w:bCs/>
+        </w:rPr>
+        <w:t xml:space="preserve">TMX-ID:</w:t>
+      </w:r>
+      <w:r>
+        <w:t xml:space="preserve"> </w:t>
+      </w:r>
+      <w:r>
+        <w:t xml:space="preserve">TMX-062</w:t>
+      </w:r>
+      <w:r>
+        <w:t xml:space="preserve"> </w:t>
+      </w:r>
+      <w:r>
+        <w:rPr>
+          <w:b/>
+          <w:bCs/>
+        </w:rPr>
+        <w:t xml:space="preserve">Status:</w:t>
+      </w:r>
+      <w:r>
+        <w:t xml:space="preserve"> </w:t>
+      </w:r>
+      <w:r>
+        <w:rPr>
+          <w:rStyle w:val="VerbatimChar"/>
+        </w:rPr>
+        <w:t xml:space="preserve">Ready for testing</w:t>
+      </w:r>
+      <w:r>
+        <w:t xml:space="preserve"> </w:t>
+      </w:r>
+      <w:r>
+        <w:rPr>
+          <w:b/>
+          <w:bCs/>
+        </w:rPr>
+        <w:t xml:space="preserve">Type:</w:t>
+      </w:r>
+      <w:r>
+        <w:t xml:space="preserve"> </w:t>
+      </w:r>
+      <w:r>
+        <w:t xml:space="preserve">Task</w:t>
+      </w:r>
+      <w:r>
+        <w:t xml:space="preserve"> </w:t>
+      </w:r>
+      <w:r>
+        <w:rPr>
+          <w:b/>
+          <w:bCs/>
+        </w:rPr>
+        <w:t xml:space="preserve">Severity:</w:t>
+      </w:r>
+      <w:r>
+        <w:t xml:space="preserve"> </w:t>
+      </w:r>
+      <w:r>
+        <w:t xml:space="preserve">HIGH</w:t>
+      </w:r>
+    </w:p>
+    <w:p>
+      <w:pPr>
+        <w:pStyle w:val="BodyText"/>
+      </w:pPr>
+      <w:r>
+        <w:t xml:space="preserve">Operator mandate 2026-06-29: no automation script or test may execute</w:t>
+      </w:r>
+      <w:r>
+        <w:t xml:space="preserve"> </w:t>
+      </w:r>
+      <w:r>
+        <w:rPr>
+          <w:rStyle w:val="VerbatimChar"/>
+        </w:rPr>
+        <w:t xml:space="preserve">sudo</w:t>
+      </w:r>
+      <w:r>
+        <w:t xml:space="preserve">/</w:t>
+      </w:r>
+      <w:r>
+        <w:rPr>
+          <w:rStyle w:val="VerbatimChar"/>
+        </w:rPr>
+        <w:t xml:space="preserve">su</w:t>
+      </w:r>
+      <w:r>
+        <w:t xml:space="preserve"> </w:t>
+      </w:r>
+      <w:r>
+        <w:t xml:space="preserve">or require human interaction. DONE this session — removed the single</w:t>
+      </w:r>
+      <w:r>
+        <w:t xml:space="preserve"> </w:t>
+      </w:r>
+      <w:r>
+        <w:rPr>
+          <w:rStyle w:val="VerbatimChar"/>
+        </w:rPr>
+        <w:t xml:space="preserve">sudo</w:t>
+      </w:r>
+      <w:r>
+        <w:t xml:space="preserve"> </w:t>
+      </w:r>
+      <w:r>
+        <w:t xml:space="preserve">execution, made install root-only, and reworded advice so</w:t>
+      </w:r>
+      <w:r>
+        <w:t xml:space="preserve"> </w:t>
+      </w:r>
+      <w:r>
+        <w:rPr>
+          <w:rStyle w:val="VerbatimChar"/>
+        </w:rPr>
+        <w:t xml:space="preserve">setup.sh</w:t>
+      </w:r>
+      <w:r>
+        <w:t xml:space="preserve"> </w:t>
+      </w:r>
+      <w:r>
+        <w:t xml:space="preserve">+</w:t>
+      </w:r>
+      <w:r>
+        <w:t xml:space="preserve"> </w:t>
+      </w:r>
+      <w:r>
+        <w:rPr>
+          <w:rStyle w:val="VerbatimChar"/>
+        </w:rPr>
+        <w:t xml:space="preserve">install_deps.sh</w:t>
+      </w:r>
+      <w:r>
+        <w:t xml:space="preserve"> </w:t>
+      </w:r>
+      <w:r>
+        <w:t xml:space="preserve">+</w:t>
+      </w:r>
+      <w:r>
+        <w:t xml:space="preserve"> </w:t>
+      </w:r>
+      <w:r>
+        <w:rPr>
+          <w:rStyle w:val="VerbatimChar"/>
+        </w:rPr>
+        <w:t xml:space="preserve">install.sh</w:t>
+      </w:r>
+      <w:r>
+        <w:t xml:space="preserve"> </w:t>
+      </w:r>
+      <w:r>
+        <w:t xml:space="preserve">contain 0</w:t>
+      </w:r>
+      <w:r>
+        <w:t xml:space="preserve"> </w:t>
+      </w:r>
+      <w:r>
+        <w:rPr>
+          <w:rStyle w:val="VerbatimChar"/>
+        </w:rPr>
+        <w:t xml:space="preserve">sudo</w:t>
+      </w:r>
+      <w:r>
+        <w:t xml:space="preserve">/</w:t>
+      </w:r>
+      <w:r>
+        <w:rPr>
+          <w:rStyle w:val="VerbatimChar"/>
+        </w:rPr>
+        <w:t xml:space="preserve">su</w:t>
+      </w:r>
+      <w:r>
+        <w:t xml:space="preserve"> </w:t>
+      </w:r>
+      <w:r>
+        <w:t xml:space="preserve">tokens; added the</w:t>
+      </w:r>
+      <w:r>
+        <w:t xml:space="preserve"> </w:t>
+      </w:r>
+      <w:r>
+        <w:rPr>
+          <w:rStyle w:val="VerbatimChar"/>
+        </w:rPr>
+        <w:t xml:space="preserve">verify.sh</w:t>
+      </w:r>
+      <w:r>
+        <w:t xml:space="preserve"> </w:t>
+      </w:r>
+      <w:r>
+        <w:t xml:space="preserve">gate</w:t>
+      </w:r>
+      <w:r>
+        <w:t xml:space="preserve"> </w:t>
+      </w:r>
+      <w:r>
+        <w:rPr>
+          <w:rStyle w:val="VerbatimChar"/>
+        </w:rPr>
+        <w:t xml:space="preserve">CM-NO-SUDO-NO-INTERACTION</w:t>
+      </w:r>
+      <w:r>
+        <w:t xml:space="preserve"> </w:t>
+      </w:r>
+      <w:r>
+        <w:t xml:space="preserve">with paired meta-mutation</w:t>
+      </w:r>
+      <w:r>
+        <w:t xml:space="preserve"> </w:t>
+      </w:r>
+      <w:r>
+        <w:rPr>
+          <w:rStyle w:val="VerbatimChar"/>
+        </w:rPr>
+        <w:t xml:space="preserve">M-CM-NO-SUDO-NO-INTERACTION</w:t>
+      </w:r>
+      <w:r>
+        <w:t xml:space="preserve"> </w:t>
+      </w:r>
+      <w:r>
+        <w:t xml:space="preserve">(CAUGHT) and test 70 case C10. Acceptance: 0</w:t>
+      </w:r>
+      <w:r>
+        <w:t xml:space="preserve"> </w:t>
+      </w:r>
+      <w:r>
+        <w:rPr>
+          <w:rStyle w:val="VerbatimChar"/>
+        </w:rPr>
+        <w:t xml:space="preserve">sudo</w:t>
+      </w:r>
+      <w:r>
+        <w:t xml:space="preserve">/</w:t>
+      </w:r>
+      <w:r>
+        <w:rPr>
+          <w:rStyle w:val="VerbatimChar"/>
+        </w:rPr>
+        <w:t xml:space="preserve">su</w:t>
+      </w:r>
+      <w:r>
+        <w:t xml:space="preserve"> </w:t>
+      </w:r>
+      <w:r>
+        <w:t xml:space="preserve">tokens AND 0 human-wait points across the in-scope files, and the gate FAILs when a</w:t>
+      </w:r>
+      <w:r>
+        <w:t xml:space="preserve"> </w:t>
+      </w:r>
+      <w:r>
+        <w:rPr>
+          <w:rStyle w:val="VerbatimChar"/>
+        </w:rPr>
+        <w:t xml:space="preserve">sudo</w:t>
+      </w:r>
+      <w:r>
+        <w:t xml:space="preserve"> </w:t>
+      </w:r>
+      <w:r>
+        <w:t xml:space="preserve">token is injected — pending commit + post-commit meta-validation on a clean tree.</w:t>
+      </w:r>
+    </w:p>
+    <w:bookmarkEnd w:id="14"/>
+    <w:bookmarkStart w:id="15" w:name="Xbbde32aad7de5d47d746c4c73aac3a5ffa4bca8"/>
+    <w:p>
+      <w:pPr>
+        <w:pStyle w:val="Heading3"/>
+      </w:pPr>
+      <w:r>
+        <w:t xml:space="preserve">A53 ROOT-FREE-LOCAL-BUILD-001 — fully-autonomous root-free local build (obtain all build deps locally; no root/sudo/interaction) —</w:t>
+      </w:r>
+      <w:r>
+        <w:t xml:space="preserve"> </w:t>
+      </w:r>
+      <w:r>
+        <w:rPr>
+          <w:rStyle w:val="VerbatimChar"/>
+        </w:rPr>
+        <w:t xml:space="preserve">PARTIAL</w:t>
+      </w:r>
+    </w:p>
+    <w:p>
+      <w:pPr>
+        <w:pStyle w:val="FirstParagraph"/>
+      </w:pPr>
+      <w:r>
+        <w:rPr>
+          <w:b/>
+          <w:bCs/>
+        </w:rPr>
+        <w:t xml:space="preserve">TMX-ID:</w:t>
+      </w:r>
+      <w:r>
+        <w:t xml:space="preserve"> </w:t>
+      </w:r>
+      <w:r>
+        <w:t xml:space="preserve">TMX-063</w:t>
+      </w:r>
+      <w:r>
+        <w:t xml:space="preserve"> </w:t>
+      </w:r>
+      <w:r>
+        <w:rPr>
+          <w:b/>
+          <w:bCs/>
+        </w:rPr>
+        <w:t xml:space="preserve">Status:</w:t>
+      </w:r>
+      <w:r>
+        <w:t xml:space="preserve"> </w:t>
+      </w:r>
+      <w:r>
+        <w:rPr>
+          <w:rStyle w:val="VerbatimChar"/>
+        </w:rPr>
+        <w:t xml:space="preserve">In progress</w:t>
+      </w:r>
+      <w:r>
+        <w:t xml:space="preserve"> </w:t>
+      </w:r>
+      <w:r>
+        <w:rPr>
+          <w:b/>
+          <w:bCs/>
+        </w:rPr>
+        <w:t xml:space="preserve">Type:</w:t>
+      </w:r>
+      <w:r>
+        <w:t xml:space="preserve"> </w:t>
+      </w:r>
+      <w:r>
+        <w:t xml:space="preserve">Feature</w:t>
+      </w:r>
+      <w:r>
+        <w:t xml:space="preserve"> </w:t>
+      </w:r>
+      <w:r>
+        <w:rPr>
+          <w:b/>
+          <w:bCs/>
+        </w:rPr>
+        <w:t xml:space="preserve">Severity:</w:t>
+      </w:r>
+      <w:r>
+        <w:t xml:space="preserve"> </w:t>
+      </w:r>
+      <w:r>
+        <w:t xml:space="preserve">HIGH</w:t>
+      </w:r>
+    </w:p>
+    <w:p>
+      <w:pPr>
+        <w:pStyle w:val="BodyText"/>
+      </w:pPr>
+      <w:r>
+        <w:t xml:space="preserve">Operator mandate 2026-06-29:</w:t>
+      </w:r>
+      <w:r>
+        <w:t xml:space="preserve"> </w:t>
+      </w:r>
+      <w:r>
+        <w:rPr>
+          <w:rStyle w:val="VerbatimChar"/>
+        </w:rPr>
+        <w:t xml:space="preserve">bash scripts/setup.sh</w:t>
+      </w:r>
+      <w:r>
+        <w:t xml:space="preserve"> </w:t>
+      </w:r>
+      <w:r>
+        <w:t xml:space="preserve">must build AND install tmux with NO root, NO sudo, and NO interaction by obtaining every mandatory build dependency locally. Research-backed plan (</w:t>
+      </w:r>
+      <w:r>
+        <w:rPr>
+          <w:rStyle w:val="VerbatimChar"/>
+        </w:rPr>
+        <w:t xml:space="preserve">docs/research/root_free_c_toolchain_20260629/</w:t>
+      </w:r>
+      <w:r>
+        <w:t xml:space="preserve">): obtain a Zig</w:t>
+      </w:r>
+      <w:r>
+        <w:t xml:space="preserve"> </w:t>
+      </w:r>
+      <w:r>
+        <w:rPr>
+          <w:rStyle w:val="VerbatimChar"/>
+        </w:rPr>
+        <w:t xml:space="preserve">zig cc</w:t>
+      </w:r>
+      <w:r>
+        <w:t xml:space="preserve"> </w:t>
+      </w:r>
+      <w:r>
+        <w:t xml:space="preserve">C toolchain into</w:t>
+      </w:r>
+      <w:r>
+        <w:t xml:space="preserve"> </w:t>
+      </w:r>
+      <w:r>
+        <w:rPr>
+          <w:rStyle w:val="VerbatimChar"/>
+        </w:rPr>
+        <w:t xml:space="preserve">.local-deps</w:t>
+      </w:r>
+      <w:r>
+        <w:t xml:space="preserve"> </w:t>
+      </w:r>
+      <w:r>
+        <w:t xml:space="preserve">(kind=toolchain, like the Go-toolchain obtain) and build tmux from the 3.6a release tarball to avoid autotools/system-cc requirements. Status In progress — research complete and a proof-of-concept live-build spike is running; implementation is pending the PoC verdict. Acceptance: a live root-free build on a real host with the system toolchain neutered produces a tmux 3.6a binary that runs, with captured evidence and N=3 deterministic reproduction — no bluff.</w:t>
+      </w:r>
+    </w:p>
+    <w:bookmarkEnd w:id="15"/>
+    <w:bookmarkStart w:id="16" w:name="X26c5c874499a6bd9975d6cbe154dcbbc5c84564"/>
+    <w:p>
+      <w:pPr>
+        <w:pStyle w:val="Heading3"/>
+      </w:pPr>
+      <w:r>
+        <w:t xml:space="preserve">A54 NO-SUDO-PROJECTWIDE-FOLLOWUP-001 — convert print-only sudo/setcap hints outside the install path and extend the no-sudo gate project-wide —</w:t>
+      </w:r>
+      <w:r>
+        <w:t xml:space="preserve"> </w:t>
+      </w:r>
+      <w:r>
+        <w:rPr>
+          <w:rStyle w:val="VerbatimChar"/>
+        </w:rPr>
+        <w:t xml:space="preserve">OPEN</w:t>
+      </w:r>
+    </w:p>
+    <w:p>
+      <w:pPr>
+        <w:pStyle w:val="FirstParagraph"/>
+      </w:pPr>
+      <w:r>
+        <w:rPr>
+          <w:b/>
+          <w:bCs/>
+        </w:rPr>
+        <w:t xml:space="preserve">TMX-ID:</w:t>
+      </w:r>
+      <w:r>
+        <w:t xml:space="preserve"> </w:t>
+      </w:r>
+      <w:r>
+        <w:t xml:space="preserve">TMX-064</w:t>
+      </w:r>
+      <w:r>
+        <w:t xml:space="preserve"> </w:t>
+      </w:r>
+      <w:r>
+        <w:rPr>
+          <w:b/>
+          <w:bCs/>
+        </w:rPr>
+        <w:t xml:space="preserve">Status:</w:t>
+      </w:r>
+      <w:r>
+        <w:t xml:space="preserve"> </w:t>
+      </w:r>
+      <w:r>
+        <w:rPr>
+          <w:rStyle w:val="VerbatimChar"/>
+        </w:rPr>
+        <w:t xml:space="preserve">OPEN</w:t>
+      </w:r>
+      <w:r>
+        <w:t xml:space="preserve"> </w:t>
+      </w:r>
+      <w:r>
+        <w:rPr>
+          <w:b/>
+          <w:bCs/>
+        </w:rPr>
+        <w:t xml:space="preserve">Type:</w:t>
+      </w:r>
+      <w:r>
+        <w:t xml:space="preserve"> </w:t>
+      </w:r>
+      <w:r>
+        <w:t xml:space="preserve">Task</w:t>
+      </w:r>
+      <w:r>
+        <w:t xml:space="preserve"> </w:t>
+      </w:r>
+      <w:r>
+        <w:rPr>
+          <w:b/>
+          <w:bCs/>
+        </w:rPr>
+        <w:t xml:space="preserve">Severity:</w:t>
+      </w:r>
+      <w:r>
+        <w:t xml:space="preserve"> </w:t>
+      </w:r>
+      <w:r>
+        <w:t xml:space="preserve">MEDIUM</w:t>
+      </w:r>
+    </w:p>
+    <w:p>
+      <w:pPr>
+        <w:pStyle w:val="BodyText"/>
+      </w:pPr>
+      <w:r>
+        <w:t xml:space="preserve">Follow-up to TMX-062: convert the remaining print-only</w:t>
+      </w:r>
+      <w:r>
+        <w:t xml:space="preserve"> </w:t>
+      </w:r>
+      <w:r>
+        <w:rPr>
+          <w:rStyle w:val="VerbatimChar"/>
+        </w:rPr>
+        <w:t xml:space="preserve">sudo</w:t>
+      </w:r>
+      <w:r>
+        <w:t xml:space="preserve">/</w:t>
+      </w:r>
+      <w:r>
+        <w:rPr>
+          <w:rStyle w:val="VerbatimChar"/>
+        </w:rPr>
+        <w:t xml:space="preserve">setcap</w:t>
+      </w:r>
+      <w:r>
+        <w:t xml:space="preserve"> </w:t>
+      </w:r>
+      <w:r>
+        <w:t xml:space="preserve">hints OUTSIDE the install path (</w:t>
+      </w:r>
+      <w:r>
+        <w:rPr>
+          <w:rStyle w:val="VerbatimChar"/>
+        </w:rPr>
+        <w:t xml:space="preserve">scripts/build_oom_set.sh</w:t>
+      </w:r>
+      <w:r>
+        <w:t xml:space="preserve">,</w:t>
+      </w:r>
+      <w:r>
+        <w:t xml:space="preserve"> </w:t>
+      </w:r>
+      <w:r>
+        <w:rPr>
+          <w:rStyle w:val="VerbatimChar"/>
+        </w:rPr>
+        <w:t xml:space="preserve">scripts/test_vm.sh</w:t>
+      </w:r>
+      <w:r>
+        <w:t xml:space="preserve">,</w:t>
+      </w:r>
+      <w:r>
+        <w:t xml:space="preserve"> </w:t>
+      </w:r>
+      <w:r>
+        <w:rPr>
+          <w:rStyle w:val="VerbatimChar"/>
+        </w:rPr>
+        <w:t xml:space="preserve">scripts/tests/08_oom_score_adj.sh</w:t>
+      </w:r>
+      <w:r>
+        <w:t xml:space="preserve">, and the</w:t>
+      </w:r>
+      <w:r>
+        <w:t xml:space="preserve"> </w:t>
+      </w:r>
+      <w:r>
+        <w:rPr>
+          <w:rStyle w:val="VerbatimChar"/>
+        </w:rPr>
+        <w:t xml:space="preserve">scripts/oom_set.c</w:t>
+      </w:r>
+      <w:r>
+        <w:t xml:space="preserve"> </w:t>
+      </w:r>
+      <w:r>
+        <w:t xml:space="preserve">comment) to "(as root)" phrasing, and extend the no-sudo gate project-wide so it detects</w:t>
+      </w:r>
+      <w:r>
+        <w:t xml:space="preserve"> </w:t>
+      </w:r>
+      <w:r>
+        <w:rPr>
+          <w:rStyle w:val="VerbatimChar"/>
+        </w:rPr>
+        <w:t xml:space="preserve">sudo</w:t>
+      </w:r>
+      <w:r>
+        <w:t xml:space="preserve">/</w:t>
+      </w:r>
+      <w:r>
+        <w:rPr>
+          <w:rStyle w:val="VerbatimChar"/>
+        </w:rPr>
+        <w:t xml:space="preserve">su</w:t>
+      </w:r>
+      <w:r>
+        <w:t xml:space="preserve"> </w:t>
+      </w:r>
+      <w:r>
+        <w:t xml:space="preserve">EXECUTION rather than mere mention. Status Queued. Acceptance: project-wide 0</w:t>
+      </w:r>
+      <w:r>
+        <w:t xml:space="preserve"> </w:t>
+      </w:r>
+      <w:r>
+        <w:rPr>
+          <w:rStyle w:val="VerbatimChar"/>
+        </w:rPr>
+        <w:t xml:space="preserve">sudo</w:t>
+      </w:r>
+      <w:r>
+        <w:t xml:space="preserve">/</w:t>
+      </w:r>
+      <w:r>
+        <w:rPr>
+          <w:rStyle w:val="VerbatimChar"/>
+        </w:rPr>
+        <w:t xml:space="preserve">su</w:t>
+      </w:r>
+      <w:r>
+        <w:t xml:space="preserve"> </w:t>
+      </w:r>
+      <w:r>
+        <w:t xml:space="preserve">execution paths, and the gate is scoped to flag execution only — no false positives on legitimate "(as root)" documentation strings.</w:t>
       </w:r>
     </w:p>
     <w:p>
@@ -1250,9 +2431,9 @@
         </w:pict>
       </w:r>
     </w:p>
-    <w:bookmarkEnd w:id="11"/>
-    <w:bookmarkEnd w:id="12"/>
-    <w:bookmarkStart w:id="13" w:name="Xb86f81d76618d54881eaba1753a4cb72beb54ce"/>
+    <w:bookmarkEnd w:id="16"/>
+    <w:bookmarkEnd w:id="17"/>
+    <w:bookmarkStart w:id="22" w:name="Xb86f81d76618d54881eaba1753a4cb72beb54ce"/>
     <w:p>
       <w:pPr>
         <w:pStyle w:val="Heading2"/>
@@ -1266,7 +2447,7 @@
         <w:pStyle w:val="FirstParagraph"/>
       </w:pPr>
       <w:r>
-        <w:t xml:space="preserve">(none open at this time — B3 P5-M20/P5-M21 escapes CLOSED in v1.0.16</w:t>
+        <w:t xml:space="preserve">(Prior B-items closed: B3 P5-M20/P5-M21 escapes CLOSED in v1.0.16</w:t>
       </w:r>
       <w:r>
         <w:t xml:space="preserve"> </w:t>
@@ -1284,7 +2465,7 @@
         <w:t xml:space="preserve">MUTATIONS CAUGHT 45 / ESCAPED 0</w:t>
       </w:r>
       <w:r>
-        <w:t xml:space="preserve">, and migrated to</w:t>
+        <w:t xml:space="preserve">, migrated to</w:t>
       </w:r>
       <w:r>
         <w:t xml:space="preserve"> </w:t>
@@ -1299,13 +2480,13 @@
         <w:t xml:space="preserve"> </w:t>
       </w:r>
       <w:r>
-        <w:t xml:space="preserve">§B3;</w:t>
-      </w:r>
-      <w:r>
-        <w:t xml:space="preserve"> </w:t>
-      </w:r>
-      <w:r>
-        <w:t xml:space="preserve">B1 CHAL-COVER-001, B2 TEST-AUDIT-001 also landed in</w:t>
+        <w:t xml:space="preserve">§B3 as TMX-054;</w:t>
+      </w:r>
+      <w:r>
+        <w:t xml:space="preserve"> </w:t>
+      </w:r>
+      <w:r>
+        <w:t xml:space="preserve">B1 CHAL-COVER-001, B2 TEST-AUDIT-001 also in</w:t>
       </w:r>
       <w:r>
         <w:t xml:space="preserve"> </w:t>
@@ -1317,7 +2498,1447 @@
         <w:t xml:space="preserve">Fixed.md</w:t>
       </w:r>
       <w:r>
-        <w:t xml:space="preserve">.)</w:t>
+        <w:t xml:space="preserve">. New open work below.)</w:t>
+      </w:r>
+    </w:p>
+    <w:bookmarkStart w:id="18" w:name="X7f68554f0f1fb7671125a028047446254a4c728"/>
+    <w:p>
+      <w:pPr>
+        <w:pStyle w:val="Heading3"/>
+      </w:pPr>
+      <w:r>
+        <w:t xml:space="preserve">B50 TEST-COVERAGE-G1-G5-001 — close test-coverage gaps G1-G5 for the v1.0.30 cross-platform install hardening —</w:t>
+      </w:r>
+      <w:r>
+        <w:t xml:space="preserve"> </w:t>
+      </w:r>
+      <w:r>
+        <w:rPr>
+          <w:rStyle w:val="VerbatimChar"/>
+        </w:rPr>
+        <w:t xml:space="preserve">OPEN</w:t>
+      </w:r>
+    </w:p>
+    <w:p>
+      <w:pPr>
+        <w:pStyle w:val="FirstParagraph"/>
+      </w:pPr>
+      <w:r>
+        <w:rPr>
+          <w:b/>
+          <w:bCs/>
+        </w:rPr>
+        <w:t xml:space="preserve">TMX-ID:</w:t>
+      </w:r>
+      <w:r>
+        <w:t xml:space="preserve"> </w:t>
+      </w:r>
+      <w:r>
+        <w:t xml:space="preserve">TMX-059</w:t>
+      </w:r>
+      <w:r>
+        <w:t xml:space="preserve"> </w:t>
+      </w:r>
+      <w:r>
+        <w:rPr>
+          <w:b/>
+          <w:bCs/>
+        </w:rPr>
+        <w:t xml:space="preserve">Status:</w:t>
+      </w:r>
+      <w:r>
+        <w:t xml:space="preserve"> </w:t>
+      </w:r>
+      <w:r>
+        <w:rPr>
+          <w:rStyle w:val="VerbatimChar"/>
+        </w:rPr>
+        <w:t xml:space="preserve">OPEN</w:t>
+      </w:r>
+      <w:r>
+        <w:t xml:space="preserve"> </w:t>
+      </w:r>
+      <w:r>
+        <w:rPr>
+          <w:b/>
+          <w:bCs/>
+        </w:rPr>
+        <w:t xml:space="preserve">Type:</w:t>
+      </w:r>
+      <w:r>
+        <w:t xml:space="preserve"> </w:t>
+      </w:r>
+      <w:r>
+        <w:t xml:space="preserve">Task</w:t>
+      </w:r>
+      <w:r>
+        <w:t xml:space="preserve"> </w:t>
+      </w:r>
+      <w:r>
+        <w:rPr>
+          <w:b/>
+          <w:bCs/>
+        </w:rPr>
+        <w:t xml:space="preserve">Severity:</w:t>
+      </w:r>
+      <w:r>
+        <w:t xml:space="preserve"> </w:t>
+      </w:r>
+      <w:r>
+        <w:t xml:space="preserve">MEDIUM</w:t>
+      </w:r>
+    </w:p>
+    <w:p>
+      <w:pPr>
+        <w:pStyle w:val="BodyText"/>
+      </w:pPr>
+      <w:r>
+        <w:t xml:space="preserve">v1.0.30 added native-build fallback (</w:t>
+      </w:r>
+      <w:r>
+        <w:rPr>
+          <w:rStyle w:val="VerbatimChar"/>
+        </w:rPr>
+        <w:t xml:space="preserve">setup.sh</w:t>
+      </w:r>
+      <w:r>
+        <w:t xml:space="preserve">),</w:t>
+      </w:r>
+      <w:r>
+        <w:t xml:space="preserve"> </w:t>
+      </w:r>
+      <w:r>
+        <w:rPr>
+          <w:rStyle w:val="VerbatimChar"/>
+        </w:rPr>
+        <w:t xml:space="preserve">build_native.sh</w:t>
+      </w:r>
+      <w:r>
+        <w:t xml:space="preserve"> </w:t>
+      </w:r>
+      <w:r>
+        <w:t xml:space="preserve">local-deps wiring</w:t>
+      </w:r>
+      <w:r>
+        <w:t xml:space="preserve"> </w:t>
+      </w:r>
+      <w:r>
+        <w:t xml:space="preserve">(</w:t>
+      </w:r>
+      <w:r>
+        <w:rPr>
+          <w:rStyle w:val="VerbatimChar"/>
+        </w:rPr>
+        <w:t xml:space="preserve">-I</w:t>
+      </w:r>
+      <w:r>
+        <w:t xml:space="preserve">/</w:t>
+      </w:r>
+      <w:r>
+        <w:rPr>
+          <w:rStyle w:val="VerbatimChar"/>
+        </w:rPr>
+        <w:t xml:space="preserve">-L</w:t>
+      </w:r>
+      <w:r>
+        <w:t xml:space="preserve"> </w:t>
+      </w:r>
+      <w:r>
+        <w:t xml:space="preserve">+</w:t>
+      </w:r>
+      <w:r>
+        <w:t xml:space="preserve"> </w:t>
+      </w:r>
+      <w:r>
+        <w:rPr>
+          <w:rStyle w:val="VerbatimChar"/>
+        </w:rPr>
+        <w:t xml:space="preserve">PKG_CONFIG_PATH</w:t>
+      </w:r>
+      <w:r>
+        <w:t xml:space="preserve">),</w:t>
+      </w:r>
+      <w:r>
+        <w:t xml:space="preserve"> </w:t>
+      </w:r>
+      <w:r>
+        <w:rPr>
+          <w:rStyle w:val="VerbatimChar"/>
+        </w:rPr>
+        <w:t xml:space="preserve">obtain_local_deps.sh</w:t>
+      </w:r>
+      <w:r>
+        <w:t xml:space="preserve"> </w:t>
+      </w:r>
+      <w:r>
+        <w:t xml:space="preserve">libevent/ncurses obtain, and the</w:t>
+      </w:r>
+      <w:r>
+        <w:t xml:space="preserve"> </w:t>
+      </w:r>
+      <w:r>
+        <w:t xml:space="preserve">escaped-colon session-color fix; the CHANGELOG tracks "test-coverage gaps G1-G5" but they</w:t>
+      </w:r>
+      <w:r>
+        <w:t xml:space="preserve"> </w:t>
+      </w:r>
+      <w:r>
+        <w:t xml:space="preserve">are NOT yet enumerated distinctly nor each covered by an anti-bluff test + paired §1.1</w:t>
+      </w:r>
+      <w:r>
+        <w:t xml:space="preserve"> </w:t>
+      </w:r>
+      <w:r>
+        <w:t xml:space="preserve">mutation.</w:t>
+      </w:r>
+      <w:r>
+        <w:t xml:space="preserve"> </w:t>
+      </w:r>
+      <w:r>
+        <w:rPr>
+          <w:b/>
+          <w:bCs/>
+        </w:rPr>
+        <w:t xml:space="preserve">Fix direction:</w:t>
+      </w:r>
+      <w:r>
+        <w:t xml:space="preserve"> </w:t>
+      </w:r>
+      <w:r>
+        <w:t xml:space="preserve">first enumerate G1-G5 precisely, then add four-layer coverage</w:t>
+      </w:r>
+      <w:r>
+        <w:t xml:space="preserve"> </w:t>
+      </w:r>
+      <w:r>
+        <w:t xml:space="preserve">(§11.4.4(b)) for each.</w:t>
+      </w:r>
+      <w:r>
+        <w:t xml:space="preserve"> </w:t>
+      </w:r>
+      <w:r>
+        <w:rPr>
+          <w:b/>
+          <w:bCs/>
+        </w:rPr>
+        <w:t xml:space="preserve">Acceptance:</w:t>
+      </w:r>
+      <w:r>
+        <w:t xml:space="preserve"> </w:t>
+      </w:r>
+      <w:r>
+        <w:t xml:space="preserve">each of G1-G5 has a named runtime test with captured</w:t>
+      </w:r>
+      <w:r>
+        <w:t xml:space="preserve"> </w:t>
+      </w:r>
+      <w:r>
+        <w:t xml:space="preserve">evidence PLUS a paired meta-test mutation that FAILs when its guard is stripped.</w:t>
+      </w:r>
+    </w:p>
+    <w:bookmarkEnd w:id="18"/>
+    <w:bookmarkStart w:id="19" w:name="X2064cdd57278112b5d954395a9b6598a69465bc"/>
+    <w:p>
+      <w:pPr>
+        <w:pStyle w:val="Heading3"/>
+      </w:pPr>
+      <w:r>
+        <w:t xml:space="preserve">B51 DB-FIXEDMD-SSOT-DRIFT-001 — reconcile DB↔Fixed.md SSoT drift (Fixed.md A46-A49 absent from the items table) —</w:t>
+      </w:r>
+      <w:r>
+        <w:t xml:space="preserve"> </w:t>
+      </w:r>
+      <w:r>
+        <w:rPr>
+          <w:rStyle w:val="VerbatimChar"/>
+        </w:rPr>
+        <w:t xml:space="preserve">INVESTIGATED</w:t>
+      </w:r>
+    </w:p>
+    <w:p>
+      <w:pPr>
+        <w:pStyle w:val="FirstParagraph"/>
+      </w:pPr>
+      <w:r>
+        <w:rPr>
+          <w:b/>
+          <w:bCs/>
+        </w:rPr>
+        <w:t xml:space="preserve">TMX-ID:</w:t>
+      </w:r>
+      <w:r>
+        <w:t xml:space="preserve"> </w:t>
+      </w:r>
+      <w:r>
+        <w:t xml:space="preserve">TMX-060</w:t>
+      </w:r>
+      <w:r>
+        <w:t xml:space="preserve"> </w:t>
+      </w:r>
+      <w:r>
+        <w:rPr>
+          <w:b/>
+          <w:bCs/>
+        </w:rPr>
+        <w:t xml:space="preserve">Status:</w:t>
+      </w:r>
+      <w:r>
+        <w:t xml:space="preserve"> </w:t>
+      </w:r>
+      <w:r>
+        <w:rPr>
+          <w:rStyle w:val="VerbatimChar"/>
+        </w:rPr>
+        <w:t xml:space="preserve">Ready for testing</w:t>
+      </w:r>
+      <w:r>
+        <w:t xml:space="preserve"> </w:t>
+      </w:r>
+      <w:r>
+        <w:rPr>
+          <w:b/>
+          <w:bCs/>
+        </w:rPr>
+        <w:t xml:space="preserve">Type:</w:t>
+      </w:r>
+      <w:r>
+        <w:t xml:space="preserve"> </w:t>
+      </w:r>
+      <w:r>
+        <w:t xml:space="preserve">Task</w:t>
+      </w:r>
+      <w:r>
+        <w:t xml:space="preserve"> </w:t>
+      </w:r>
+      <w:r>
+        <w:rPr>
+          <w:b/>
+          <w:bCs/>
+        </w:rPr>
+        <w:t xml:space="preserve">Severity:</w:t>
+      </w:r>
+      <w:r>
+        <w:t xml:space="preserve"> </w:t>
+      </w:r>
+      <w:r>
+        <w:t xml:space="preserve">MEDIUM</w:t>
+      </w:r>
+    </w:p>
+    <w:p>
+      <w:pPr>
+        <w:pStyle w:val="BodyText"/>
+      </w:pPr>
+      <w:r>
+        <w:t xml:space="preserve">The §11.4.93 workable-items DB is missing four RESOLVED</w:t>
+      </w:r>
+      <w:r>
+        <w:t xml:space="preserve"> </w:t>
+      </w:r>
+      <w:r>
+        <w:rPr>
+          <w:rStyle w:val="VerbatimChar"/>
+        </w:rPr>
+        <w:t xml:space="preserve">Fixed.md</w:t>
+      </w:r>
+      <w:r>
+        <w:t xml:space="preserve"> </w:t>
+      </w:r>
+      <w:r>
+        <w:t xml:space="preserve">entries — A46 (libtinfo</w:t>
+      </w:r>
+      <w:r>
+        <w:t xml:space="preserve"> </w:t>
+      </w:r>
+      <w:r>
+        <w:t xml:space="preserve">version warning), A47 (test-harness timing races), A48 (distribution orchestrator binary),</w:t>
+      </w:r>
+      <w:r>
+        <w:t xml:space="preserve"> </w:t>
+      </w:r>
+      <w:r>
+        <w:t xml:space="preserve">A49 (test 17 scrollback load flake). A full</w:t>
+      </w:r>
+      <w:r>
+        <w:t xml:space="preserve"> </w:t>
+      </w:r>
+      <w:r>
+        <w:rPr>
+          <w:rStyle w:val="VerbatimChar"/>
+        </w:rPr>
+        <w:t xml:space="preserve">md-to-db</w:t>
+      </w:r>
+      <w:r>
+        <w:t xml:space="preserve"> </w:t>
+      </w:r>
+      <w:r>
+        <w:t xml:space="preserve">over</w:t>
+      </w:r>
+      <w:r>
+        <w:t xml:space="preserve"> </w:t>
+      </w:r>
+      <w:r>
+        <w:rPr>
+          <w:rStyle w:val="VerbatimChar"/>
+        </w:rPr>
+        <w:t xml:space="preserve">Fixed.md</w:t>
+      </w:r>
+      <w:r>
+        <w:t xml:space="preserve"> </w:t>
+      </w:r>
+      <w:r>
+        <w:t xml:space="preserve">reports</w:t>
+      </w:r>
+      <w:r>
+        <w:t xml:space="preserve"> </w:t>
+      </w:r>
+      <w:r>
+        <w:rPr>
+          <w:rStyle w:val="VerbatimChar"/>
+        </w:rPr>
+        <w:t xml:space="preserve">inserted=4 updated=1 allocated=4</w:t>
+      </w:r>
+      <w:r>
+        <w:t xml:space="preserve">, proving the items table never captured them (the</w:t>
+      </w:r>
+      <w:r>
+        <w:t xml:space="preserve"> </w:t>
+      </w:r>
+      <w:r>
+        <w:t xml:space="preserve">CHANGELOG names this "DB↔Fixed.md SSoT drift" as a tracked follow-up).</w:t>
+      </w:r>
+      <w:r>
+        <w:t xml:space="preserve"> </w:t>
+      </w:r>
+      <w:r>
+        <w:rPr>
+          <w:b/>
+          <w:bCs/>
+        </w:rPr>
+        <w:t xml:space="preserve">Fix direction:</w:t>
+      </w:r>
+      <w:r>
+        <w:t xml:space="preserve"> </w:t>
+      </w:r>
+      <w:r>
+        <w:t xml:space="preserve">reconcile carefully — confirm none are reworded duplicates of an existing id before</w:t>
+      </w:r>
+      <w:r>
+        <w:t xml:space="preserve"> </w:t>
+      </w:r>
+      <w:r>
+        <w:t xml:space="preserve">allocating, identify the</w:t>
+      </w:r>
+      <w:r>
+        <w:t xml:space="preserve"> </w:t>
+      </w:r>
+      <w:r>
+        <w:rPr>
+          <w:rStyle w:val="VerbatimChar"/>
+        </w:rPr>
+        <w:t xml:space="preserve">updated=1</w:t>
+      </w:r>
+      <w:r>
+        <w:t xml:space="preserve"> </w:t>
+      </w:r>
+      <w:r>
+        <w:t xml:space="preserve">item, then sync so</w:t>
+      </w:r>
+      <w:r>
+        <w:t xml:space="preserve"> </w:t>
+      </w:r>
+      <w:r>
+        <w:rPr>
+          <w:rStyle w:val="VerbatimChar"/>
+        </w:rPr>
+        <w:t xml:space="preserve">validate</w:t>
+      </w:r>
+      <w:r>
+        <w:t xml:space="preserve"> </w:t>
+      </w:r>
+      <w:r>
+        <w:t xml:space="preserve">+</w:t>
+      </w:r>
+      <w:r>
+        <w:t xml:space="preserve"> </w:t>
+      </w:r>
+      <w:r>
+        <w:rPr>
+          <w:rStyle w:val="VerbatimChar"/>
+        </w:rPr>
+        <w:t xml:space="preserve">diff</w:t>
+      </w:r>
+      <w:r>
+        <w:t xml:space="preserve"> </w:t>
+      </w:r>
+      <w:r>
+        <w:t xml:space="preserve">stay clean.</w:t>
+      </w:r>
+      <w:r>
+        <w:t xml:space="preserve"> </w:t>
+      </w:r>
+      <w:r>
+        <w:rPr>
+          <w:b/>
+          <w:bCs/>
+        </w:rPr>
+        <w:t xml:space="preserve">Acceptance:</w:t>
+      </w:r>
+      <w:r>
+        <w:t xml:space="preserve"> </w:t>
+      </w:r>
+      <w:r>
+        <w:rPr>
+          <w:rStyle w:val="VerbatimChar"/>
+        </w:rPr>
+        <w:t xml:space="preserve">md-to-db</w:t>
+      </w:r>
+      <w:r>
+        <w:t xml:space="preserve"> </w:t>
+      </w:r>
+      <w:r>
+        <w:t xml:space="preserve">over the full corpus reports</w:t>
+      </w:r>
+      <w:r>
+        <w:t xml:space="preserve"> </w:t>
+      </w:r>
+      <w:r>
+        <w:rPr>
+          <w:rStyle w:val="VerbatimChar"/>
+        </w:rPr>
+        <w:t xml:space="preserve">inserted=0 updated=0</w:t>
+      </w:r>
+      <w:r>
+        <w:t xml:space="preserve"> </w:t>
+      </w:r>
+      <w:r>
+        <w:t xml:space="preserve">(idempotent)</w:t>
+      </w:r>
+      <w:r>
+        <w:t xml:space="preserve"> </w:t>
+      </w:r>
+      <w:r>
+        <w:t xml:space="preserve">and</w:t>
+      </w:r>
+      <w:r>
+        <w:t xml:space="preserve"> </w:t>
+      </w:r>
+      <w:r>
+        <w:rPr>
+          <w:rStyle w:val="VerbatimChar"/>
+        </w:rPr>
+        <w:t xml:space="preserve">validate</w:t>
+      </w:r>
+      <w:r>
+        <w:t xml:space="preserve"> </w:t>
+      </w:r>
+      <w:r>
+        <w:t xml:space="preserve">is 0-findings.</w:t>
+      </w:r>
+      <w:r>
+        <w:t xml:space="preserve"> </w:t>
+      </w:r>
+      <w:r>
+        <w:rPr>
+          <w:b/>
+          <w:bCs/>
+        </w:rPr>
+        <w:t xml:space="preserve">Reconcile (2026-06-29, this session):</w:t>
+      </w:r>
+      <w:r>
+        <w:t xml:space="preserve"> </w:t>
+      </w:r>
+      <w:r>
+        <w:t xml:space="preserve">ran</w:t>
+      </w:r>
+      <w:r>
+        <w:t xml:space="preserve"> </w:t>
+      </w:r>
+      <w:r>
+        <w:rPr>
+          <w:rStyle w:val="VerbatimChar"/>
+        </w:rPr>
+        <w:t xml:space="preserve">sync md-to-db</w:t>
+      </w:r>
+      <w:r>
+        <w:t xml:space="preserve"> </w:t>
+      </w:r>
+      <w:r>
+        <w:t xml:space="preserve">over the full corpus — the</w:t>
+      </w:r>
+      <w:r>
+        <w:t xml:space="preserve"> </w:t>
+      </w:r>
+      <w:r>
+        <w:t xml:space="preserve">four entries ingested as TMX-067 (A49 → Completed), TMX-068 (A48 → Implemented), TMX-069</w:t>
+      </w:r>
+      <w:r>
+        <w:t xml:space="preserve"> </w:t>
+      </w:r>
+      <w:r>
+        <w:t xml:space="preserve">(A46 → Fixed) and TMX-070 (A47 → Fixed); the</w:t>
+      </w:r>
+      <w:r>
+        <w:t xml:space="preserve"> </w:t>
+      </w:r>
+      <w:r>
+        <w:rPr>
+          <w:rStyle w:val="VerbatimChar"/>
+        </w:rPr>
+        <w:t xml:space="preserve">updated=1</w:t>
+      </w:r>
+      <w:r>
+        <w:t xml:space="preserve"> </w:t>
+      </w:r>
+      <w:r>
+        <w:t xml:space="preserve">item was TMX-045 ("Per-host-topology</w:t>
+      </w:r>
+      <w:r>
+        <w:t xml:space="preserve"> </w:t>
+      </w:r>
+      <w:r>
+        <w:t xml:space="preserve">dispatch probe") whose stored</w:t>
+      </w:r>
+      <w:r>
+        <w:t xml:space="preserve"> </w:t>
+      </w:r>
+      <w:r>
+        <w:rPr>
+          <w:rStyle w:val="VerbatimChar"/>
+        </w:rPr>
+        <w:t xml:space="preserve">raw_body</w:t>
+      </w:r>
+      <w:r>
+        <w:t xml:space="preserve"> </w:t>
+      </w:r>
+      <w:r>
+        <w:t xml:space="preserve">was stale (2140→7648 chars) and was refreshed from</w:t>
+      </w:r>
+      <w:r>
+        <w:t xml:space="preserve"> </w:t>
+      </w:r>
+      <w:r>
+        <w:t xml:space="preserve">the current</w:t>
+      </w:r>
+      <w:r>
+        <w:t xml:space="preserve"> </w:t>
+      </w:r>
+      <w:r>
+        <w:rPr>
+          <w:rStyle w:val="VerbatimChar"/>
+        </w:rPr>
+        <w:t xml:space="preserve">Fixed.md</w:t>
+      </w:r>
+      <w:r>
+        <w:t xml:space="preserve"> </w:t>
+      </w:r>
+      <w:r>
+        <w:t xml:space="preserve">— no other field changed, so it is not a reworded duplicate. The run</w:t>
+      </w:r>
+      <w:r>
+        <w:t xml:space="preserve"> </w:t>
+      </w:r>
+      <w:r>
+        <w:t xml:space="preserve">also re-captured the stale</w:t>
+      </w:r>
+      <w:r>
+        <w:t xml:space="preserve"> </w:t>
+      </w:r>
+      <w:r>
+        <w:rPr>
+          <w:rStyle w:val="VerbatimChar"/>
+        </w:rPr>
+        <w:t xml:space="preserve">document_sources[Fixed]</w:t>
+      </w:r>
+      <w:r>
+        <w:t xml:space="preserve"> </w:t>
+      </w:r>
+      <w:r>
+        <w:t xml:space="preserve">so a future</w:t>
+      </w:r>
+      <w:r>
+        <w:t xml:space="preserve"> </w:t>
+      </w:r>
+      <w:r>
+        <w:rPr>
+          <w:rStyle w:val="VerbatimChar"/>
+        </w:rPr>
+        <w:t xml:space="preserve">db-to-md</w:t>
+      </w:r>
+      <w:r>
+        <w:t xml:space="preserve"> </w:t>
+      </w:r>
+      <w:r>
+        <w:t xml:space="preserve">no longer</w:t>
+      </w:r>
+      <w:r>
+        <w:t xml:space="preserve"> </w:t>
+      </w:r>
+      <w:r>
+        <w:t xml:space="preserve">regresses</w:t>
+      </w:r>
+      <w:r>
+        <w:t xml:space="preserve"> </w:t>
+      </w:r>
+      <w:r>
+        <w:rPr>
+          <w:rStyle w:val="VerbatimChar"/>
+        </w:rPr>
+        <w:t xml:space="preserve">Fixed.md</w:t>
+      </w:r>
+      <w:r>
+        <w:t xml:space="preserve">. A second</w:t>
+      </w:r>
+      <w:r>
+        <w:t xml:space="preserve"> </w:t>
+      </w:r>
+      <w:r>
+        <w:rPr>
+          <w:rStyle w:val="VerbatimChar"/>
+        </w:rPr>
+        <w:t xml:space="preserve">md-to-db</w:t>
+      </w:r>
+      <w:r>
+        <w:t xml:space="preserve"> </w:t>
+      </w:r>
+      <w:r>
+        <w:t xml:space="preserve">reports</w:t>
+      </w:r>
+      <w:r>
+        <w:t xml:space="preserve"> </w:t>
+      </w:r>
+      <w:r>
+        <w:rPr>
+          <w:rStyle w:val="VerbatimChar"/>
+        </w:rPr>
+        <w:t xml:space="preserve">inserted=0 updated=0</w:t>
+      </w:r>
+      <w:r>
+        <w:t xml:space="preserve"> </w:t>
+      </w:r>
+      <w:r>
+        <w:t xml:space="preserve">(idempotent) and</w:t>
+      </w:r>
+      <w:r>
+        <w:t xml:space="preserve"> </w:t>
+      </w:r>
+      <w:r>
+        <w:rPr>
+          <w:rStyle w:val="VerbatimChar"/>
+        </w:rPr>
+        <w:t xml:space="preserve">validate</w:t>
+      </w:r>
+      <w:r>
+        <w:t xml:space="preserve"> </w:t>
+      </w:r>
+      <w:r>
+        <w:t xml:space="preserve">is 0-findings — pending conductor verification + close.</w:t>
+      </w:r>
+    </w:p>
+    <w:bookmarkEnd w:id="19"/>
+    <w:bookmarkStart w:id="20" w:name="Xe1b8a2142e32c6f2592557af404df6cefeb9b93"/>
+    <w:p>
+      <w:pPr>
+        <w:pStyle w:val="Heading3"/>
+      </w:pPr>
+      <w:r>
+        <w:t xml:space="preserve">B52 WI-PARSER-GREEDY-BIND-001 — workable-items md-parser absorbs a following no-period block's TMX-ID → UNIQUE-constraint failure —</w:t>
+      </w:r>
+      <w:r>
+        <w:t xml:space="preserve"> </w:t>
+      </w:r>
+      <w:r>
+        <w:rPr>
+          <w:rStyle w:val="VerbatimChar"/>
+        </w:rPr>
+        <w:t xml:space="preserve">INVESTIGATED</w:t>
+      </w:r>
+    </w:p>
+    <w:p>
+      <w:pPr>
+        <w:pStyle w:val="FirstParagraph"/>
+      </w:pPr>
+      <w:r>
+        <w:rPr>
+          <w:b/>
+          <w:bCs/>
+        </w:rPr>
+        <w:t xml:space="preserve">TMX-ID:</w:t>
+      </w:r>
+      <w:r>
+        <w:t xml:space="preserve"> </w:t>
+      </w:r>
+      <w:r>
+        <w:t xml:space="preserve">TMX-065</w:t>
+      </w:r>
+      <w:r>
+        <w:t xml:space="preserve"> </w:t>
+      </w:r>
+      <w:r>
+        <w:rPr>
+          <w:b/>
+          <w:bCs/>
+        </w:rPr>
+        <w:t xml:space="preserve">Status:</w:t>
+      </w:r>
+      <w:r>
+        <w:t xml:space="preserve"> </w:t>
+      </w:r>
+      <w:r>
+        <w:rPr>
+          <w:rStyle w:val="VerbatimChar"/>
+        </w:rPr>
+        <w:t xml:space="preserve">Ready for testing</w:t>
+      </w:r>
+      <w:r>
+        <w:t xml:space="preserve"> </w:t>
+      </w:r>
+      <w:r>
+        <w:rPr>
+          <w:b/>
+          <w:bCs/>
+        </w:rPr>
+        <w:t xml:space="preserve">Type:</w:t>
+      </w:r>
+      <w:r>
+        <w:t xml:space="preserve"> </w:t>
+      </w:r>
+      <w:r>
+        <w:t xml:space="preserve">Bug</w:t>
+      </w:r>
+      <w:r>
+        <w:t xml:space="preserve"> </w:t>
+      </w:r>
+      <w:r>
+        <w:rPr>
+          <w:b/>
+          <w:bCs/>
+        </w:rPr>
+        <w:t xml:space="preserve">Severity:</w:t>
+      </w:r>
+      <w:r>
+        <w:t xml:space="preserve"> </w:t>
+      </w:r>
+      <w:r>
+        <w:t xml:space="preserve">HIGH</w:t>
+      </w:r>
+    </w:p>
+    <w:p>
+      <w:pPr>
+        <w:pStyle w:val="BodyText"/>
+      </w:pPr>
+      <w:r>
+        <w:rPr>
+          <w:rStyle w:val="VerbatimChar"/>
+        </w:rPr>
+        <w:t xml:space="preserve">cmd/workable-items/parser.go</w:t>
+      </w:r>
+      <w:r>
+        <w:t xml:space="preserve"> </w:t>
+      </w:r>
+      <w:r>
+        <w:t xml:space="preserve">greedily extended a period-style heading's (</w:t>
+      </w:r>
+      <w:r>
+        <w:rPr>
+          <w:rStyle w:val="VerbatimChar"/>
+        </w:rPr>
+        <w:t xml:space="preserve">### A54. …</w:t>
+      </w:r>
+      <w:r>
+        <w:t xml:space="preserve">,</w:t>
+      </w:r>
+      <w:r>
+        <w:t xml:space="preserve"> </w:t>
+      </w:r>
+      <w:r>
+        <w:t xml:space="preserve">which matches</w:t>
+      </w:r>
+      <w:r>
+        <w:t xml:space="preserve"> </w:t>
+      </w:r>
+      <w:r>
+        <w:rPr>
+          <w:rStyle w:val="VerbatimChar"/>
+        </w:rPr>
+        <w:t xml:space="preserve">headingRE</w:t>
+      </w:r>
+      <w:r>
+        <w:t xml:space="preserve">) 24-line structured-metadata window across any FOLLOWING no-period</w:t>
+      </w:r>
+      <w:r>
+        <w:t xml:space="preserve"> </w:t>
+      </w:r>
+      <w:r>
+        <w:rPr>
+          <w:rStyle w:val="VerbatimChar"/>
+        </w:rPr>
+        <w:t xml:space="preserve">### </w:t>
+      </w:r>
+      <w:r>
+        <w:t xml:space="preserve"> </w:t>
+      </w:r>
+      <w:r>
+        <w:t xml:space="preserve">block, mis-binding that block's</w:t>
+      </w:r>
+      <w:r>
+        <w:t xml:space="preserve"> </w:t>
+      </w:r>
+      <w:r>
+        <w:rPr>
+          <w:rStyle w:val="VerbatimChar"/>
+        </w:rPr>
+        <w:t xml:space="preserve">**TMX-ID:**</w:t>
+      </w:r>
+      <w:r>
+        <w:t xml:space="preserve"> </w:t>
+      </w:r>
+      <w:r>
+        <w:t xml:space="preserve">/</w:t>
+      </w:r>
+      <w:r>
+        <w:t xml:space="preserve"> </w:t>
+      </w:r>
+      <w:r>
+        <w:rPr>
+          <w:rStyle w:val="VerbatimChar"/>
+        </w:rPr>
+        <w:t xml:space="preserve">**Type:**</w:t>
+      </w:r>
+      <w:r>
+        <w:t xml:space="preserve"> </w:t>
+      </w:r>
+      <w:r>
+        <w:t xml:space="preserve">/</w:t>
+      </w:r>
+      <w:r>
+        <w:t xml:space="preserve"> </w:t>
+      </w:r>
+      <w:r>
+        <w:rPr>
+          <w:rStyle w:val="VerbatimChar"/>
+        </w:rPr>
+        <w:t xml:space="preserve">**Status:**</w:t>
+      </w:r>
+      <w:r>
+        <w:t xml:space="preserve"> </w:t>
+      </w:r>
+      <w:r>
+        <w:t xml:space="preserve">to the</w:t>
+      </w:r>
+      <w:r>
+        <w:t xml:space="preserve"> </w:t>
+      </w:r>
+      <w:r>
+        <w:t xml:space="preserve">period item — so</w:t>
+      </w:r>
+      <w:r>
+        <w:t xml:space="preserve"> </w:t>
+      </w:r>
+      <w:r>
+        <w:rPr>
+          <w:rStyle w:val="VerbatimChar"/>
+        </w:rPr>
+        <w:t xml:space="preserve">sync md-to-db</w:t>
+      </w:r>
+      <w:r>
+        <w:t xml:space="preserve"> </w:t>
+      </w:r>
+      <w:r>
+        <w:t xml:space="preserve">aborted with</w:t>
+      </w:r>
+      <w:r>
+        <w:t xml:space="preserve"> </w:t>
+      </w:r>
+      <w:r>
+        <w:rPr>
+          <w:rStyle w:val="VerbatimChar"/>
+        </w:rPr>
+        <w:t xml:space="preserve">UNIQUE constraint failed: items.atm_id</w:t>
+      </w:r>
+      <w:r>
+        <w:t xml:space="preserve"> </w:t>
+      </w:r>
+      <w:r>
+        <w:t xml:space="preserve">(forced a §9.2 DB restore this session). FIXED this session: the parser now closes the</w:t>
+      </w:r>
+      <w:r>
+        <w:t xml:space="preserve"> </w:t>
+      </w:r>
+      <w:r>
+        <w:t xml:space="preserve">structured-metadata window at the first subsequent Markdown heading of ANY level</w:t>
+      </w:r>
+      <w:r>
+        <w:t xml:space="preserve"> </w:t>
+      </w:r>
+      <w:r>
+        <w:t xml:space="preserve">(</w:t>
+      </w:r>
+      <w:r>
+        <w:rPr>
+          <w:rStyle w:val="VerbatimChar"/>
+        </w:rPr>
+        <w:t xml:space="preserve">anyHeadingRE</w:t>
+      </w:r>
+      <w:r>
+        <w:t xml:space="preserve">), so a following block's metadata can never be absorbed by a preceding</w:t>
+      </w:r>
+      <w:r>
+        <w:t xml:space="preserve"> </w:t>
+      </w:r>
+      <w:r>
+        <w:t xml:space="preserve">period item. Guarded by</w:t>
+      </w:r>
+      <w:r>
+        <w:t xml:space="preserve"> </w:t>
+      </w:r>
+      <w:r>
+        <w:rPr>
+          <w:rStyle w:val="VerbatimChar"/>
+        </w:rPr>
+        <w:t xml:space="preserve">cmd/workable-items/parser_greedybind_test.go</w:t>
+      </w:r>
+      <w:r>
+        <w:t xml:space="preserve"> </w:t>
+      </w:r>
+      <w:r>
+        <w:t xml:space="preserve">RED→GREEN</w:t>
+      </w:r>
+      <w:r>
+        <w:t xml:space="preserve"> </w:t>
+      </w:r>
+      <w:r>
+        <w:t xml:space="preserve">(parser-level absorption test + end-to-end UNIQUE-collision regression).</w:t>
+      </w:r>
+      <w:r>
+        <w:t xml:space="preserve"> </w:t>
+      </w:r>
+      <w:r>
+        <w:rPr>
+          <w:b/>
+          <w:bCs/>
+        </w:rPr>
+        <w:t xml:space="preserve">Acceptance:</w:t>
+      </w:r>
+      <w:r>
+        <w:t xml:space="preserve"> </w:t>
+      </w:r>
+      <w:r>
+        <w:t xml:space="preserve">a</w:t>
+      </w:r>
+      <w:r>
+        <w:t xml:space="preserve"> </w:t>
+      </w:r>
+      <w:r>
+        <w:t xml:space="preserve">period heading never absorbs a following block's TMX-ID/Type and</w:t>
+      </w:r>
+      <w:r>
+        <w:t xml:space="preserve"> </w:t>
+      </w:r>
+      <w:r>
+        <w:rPr>
+          <w:rStyle w:val="VerbatimChar"/>
+        </w:rPr>
+        <w:t xml:space="preserve">md-to-db</w:t>
+      </w:r>
+      <w:r>
+        <w:t xml:space="preserve"> </w:t>
+      </w:r>
+      <w:r>
+        <w:t xml:space="preserve">raises no UNIQUE</w:t>
+      </w:r>
+      <w:r>
+        <w:t xml:space="preserve"> </w:t>
+      </w:r>
+      <w:r>
+        <w:t xml:space="preserve">error —</w:t>
+      </w:r>
+      <w:r>
+        <w:t xml:space="preserve"> </w:t>
+      </w:r>
+      <w:r>
+        <w:rPr>
+          <w:rStyle w:val="VerbatimChar"/>
+        </w:rPr>
+        <w:t xml:space="preserve">go test ./cmd/workable-items</w:t>
+      </w:r>
+      <w:r>
+        <w:t xml:space="preserve"> </w:t>
+      </w:r>
+      <w:r>
+        <w:t xml:space="preserve">GREEN; pending conductor verification + close.</w:t>
+      </w:r>
+    </w:p>
+    <w:bookmarkEnd w:id="20"/>
+    <w:bookmarkStart w:id="21" w:name="X786006b430de5e875512b4be2d4eabd4244eab3"/>
+    <w:p>
+      <w:pPr>
+        <w:pStyle w:val="Heading3"/>
+      </w:pPr>
+      <w:r>
+        <w:t xml:space="preserve">B53 WI-SET-STATUS-COMMAND-001 — workable-items had no command to set a non-terminal status (manual sqlite3 UPDATE required) —</w:t>
+      </w:r>
+      <w:r>
+        <w:t xml:space="preserve"> </w:t>
+      </w:r>
+      <w:r>
+        <w:rPr>
+          <w:rStyle w:val="VerbatimChar"/>
+        </w:rPr>
+        <w:t xml:space="preserve">INVESTIGATED</w:t>
+      </w:r>
+    </w:p>
+    <w:p>
+      <w:pPr>
+        <w:pStyle w:val="FirstParagraph"/>
+      </w:pPr>
+      <w:r>
+        <w:rPr>
+          <w:b/>
+          <w:bCs/>
+        </w:rPr>
+        <w:t xml:space="preserve">TMX-ID:</w:t>
+      </w:r>
+      <w:r>
+        <w:t xml:space="preserve"> </w:t>
+      </w:r>
+      <w:r>
+        <w:t xml:space="preserve">TMX-066</w:t>
+      </w:r>
+      <w:r>
+        <w:t xml:space="preserve"> </w:t>
+      </w:r>
+      <w:r>
+        <w:rPr>
+          <w:b/>
+          <w:bCs/>
+        </w:rPr>
+        <w:t xml:space="preserve">Status:</w:t>
+      </w:r>
+      <w:r>
+        <w:t xml:space="preserve"> </w:t>
+      </w:r>
+      <w:r>
+        <w:rPr>
+          <w:rStyle w:val="VerbatimChar"/>
+        </w:rPr>
+        <w:t xml:space="preserve">Ready for testing</w:t>
+      </w:r>
+      <w:r>
+        <w:t xml:space="preserve"> </w:t>
+      </w:r>
+      <w:r>
+        <w:rPr>
+          <w:b/>
+          <w:bCs/>
+        </w:rPr>
+        <w:t xml:space="preserve">Type:</w:t>
+      </w:r>
+      <w:r>
+        <w:t xml:space="preserve"> </w:t>
+      </w:r>
+      <w:r>
+        <w:t xml:space="preserve">Bug</w:t>
+      </w:r>
+      <w:r>
+        <w:t xml:space="preserve"> </w:t>
+      </w:r>
+      <w:r>
+        <w:rPr>
+          <w:b/>
+          <w:bCs/>
+        </w:rPr>
+        <w:t xml:space="preserve">Severity:</w:t>
+      </w:r>
+      <w:r>
+        <w:t xml:space="preserve"> </w:t>
+      </w:r>
+      <w:r>
+        <w:t xml:space="preserve">MEDIUM</w:t>
+      </w:r>
+    </w:p>
+    <w:p>
+      <w:pPr>
+        <w:pStyle w:val="BodyText"/>
+      </w:pPr>
+      <w:r>
+        <w:rPr>
+          <w:rStyle w:val="VerbatimChar"/>
+        </w:rPr>
+        <w:t xml:space="preserve">workable-items add</w:t>
+      </w:r>
+      <w:r>
+        <w:t xml:space="preserve"> </w:t>
+      </w:r>
+      <w:r>
+        <w:t xml:space="preserve">only ever creates a</w:t>
+      </w:r>
+      <w:r>
+        <w:t xml:space="preserve"> </w:t>
+      </w:r>
+      <w:r>
+        <w:rPr>
+          <w:rStyle w:val="VerbatimChar"/>
+        </w:rPr>
+        <w:t xml:space="preserve">Queued</w:t>
+      </w:r>
+      <w:r>
+        <w:t xml:space="preserve"> </w:t>
+      </w:r>
+      <w:r>
+        <w:t xml:space="preserve">item and</w:t>
+      </w:r>
+      <w:r>
+        <w:t xml:space="preserve"> </w:t>
+      </w:r>
+      <w:r>
+        <w:rPr>
+          <w:rStyle w:val="VerbatimChar"/>
+        </w:rPr>
+        <w:t xml:space="preserve">close</w:t>
+      </w:r>
+      <w:r>
+        <w:t xml:space="preserve"> </w:t>
+      </w:r>
+      <w:r>
+        <w:t xml:space="preserve">only ever assigns a</w:t>
+      </w:r>
+      <w:r>
+        <w:t xml:space="preserve"> </w:t>
+      </w:r>
+      <w:r>
+        <w:t xml:space="preserve">TERMINAL closure status, so moving an item to a non-terminal §11.4.15/§11.4.21 status</w:t>
+      </w:r>
+      <w:r>
+        <w:t xml:space="preserve"> </w:t>
+      </w:r>
+      <w:r>
+        <w:t xml:space="preserve">(</w:t>
+      </w:r>
+      <w:r>
+        <w:rPr>
+          <w:rStyle w:val="VerbatimChar"/>
+        </w:rPr>
+        <w:t xml:space="preserve">In progress</w:t>
+      </w:r>
+      <w:r>
+        <w:t xml:space="preserve"> </w:t>
+      </w:r>
+      <w:r>
+        <w:t xml:space="preserve">/</w:t>
+      </w:r>
+      <w:r>
+        <w:t xml:space="preserve"> </w:t>
+      </w:r>
+      <w:r>
+        <w:rPr>
+          <w:rStyle w:val="VerbatimChar"/>
+        </w:rPr>
+        <w:t xml:space="preserve">Ready for testing</w:t>
+      </w:r>
+      <w:r>
+        <w:t xml:space="preserve"> </w:t>
+      </w:r>
+      <w:r>
+        <w:t xml:space="preserve">/</w:t>
+      </w:r>
+      <w:r>
+        <w:t xml:space="preserve"> </w:t>
+      </w:r>
+      <w:r>
+        <w:rPr>
+          <w:rStyle w:val="VerbatimChar"/>
+        </w:rPr>
+        <w:t xml:space="preserve">In testing</w:t>
+      </w:r>
+      <w:r>
+        <w:t xml:space="preserve"> </w:t>
+      </w:r>
+      <w:r>
+        <w:t xml:space="preserve">/</w:t>
+      </w:r>
+      <w:r>
+        <w:t xml:space="preserve"> </w:t>
+      </w:r>
+      <w:r>
+        <w:rPr>
+          <w:rStyle w:val="VerbatimChar"/>
+        </w:rPr>
+        <w:t xml:space="preserve">Reopened</w:t>
+      </w:r>
+      <w:r>
+        <w:t xml:space="preserve"> </w:t>
+      </w:r>
+      <w:r>
+        <w:t xml:space="preserve">/</w:t>
+      </w:r>
+      <w:r>
+        <w:t xml:space="preserve"> </w:t>
+      </w:r>
+      <w:r>
+        <w:rPr>
+          <w:rStyle w:val="VerbatimChar"/>
+        </w:rPr>
+        <w:t xml:space="preserve">Operator-blocked</w:t>
+      </w:r>
+      <w:r>
+        <w:t xml:space="preserve">)</w:t>
+      </w:r>
+      <w:r>
+        <w:t xml:space="preserve"> </w:t>
+      </w:r>
+      <w:r>
+        <w:t xml:space="preserve">required a hand-written</w:t>
+      </w:r>
+      <w:r>
+        <w:t xml:space="preserve"> </w:t>
+      </w:r>
+      <w:r>
+        <w:rPr>
+          <w:rStyle w:val="VerbatimChar"/>
+        </w:rPr>
+        <w:t xml:space="preserve">sqlite3 UPDATE</w:t>
+      </w:r>
+      <w:r>
+        <w:t xml:space="preserve"> </w:t>
+      </w:r>
+      <w:r>
+        <w:t xml:space="preserve">that bypassed the §11.4.34 audit trail and the</w:t>
+      </w:r>
+      <w:r>
+        <w:t xml:space="preserve"> </w:t>
+      </w:r>
+      <w:r>
+        <w:t xml:space="preserve">§11.4.93 SSoT discipline. FIXED this session: new</w:t>
+      </w:r>
+      <w:r>
+        <w:t xml:space="preserve"> </w:t>
+      </w:r>
+      <w:r>
+        <w:rPr>
+          <w:rStyle w:val="VerbatimChar"/>
+        </w:rPr>
+        <w:t xml:space="preserve">workable-items set-status TMX-NNN --status &lt;non-terminal&gt; [--by AI|User] [--reason …]</w:t>
+      </w:r>
+      <w:r>
+        <w:t xml:space="preserve"> </w:t>
+      </w:r>
+      <w:r>
+        <w:t xml:space="preserve">writes the status +</w:t>
+      </w:r>
+      <w:r>
+        <w:t xml:space="preserve"> </w:t>
+      </w:r>
+      <w:r>
+        <w:rPr>
+          <w:rStyle w:val="VerbatimChar"/>
+        </w:rPr>
+        <w:t xml:space="preserve">last_modified</w:t>
+      </w:r>
+      <w:r>
+        <w:t xml:space="preserve"> </w:t>
+      </w:r>
+      <w:r>
+        <w:t xml:space="preserve">+</w:t>
+      </w:r>
+      <w:r>
+        <w:t xml:space="preserve"> </w:t>
+      </w:r>
+      <w:r>
+        <w:t xml:space="preserve">an audited</w:t>
+      </w:r>
+      <w:r>
+        <w:t xml:space="preserve"> </w:t>
+      </w:r>
+      <w:r>
+        <w:rPr>
+          <w:rStyle w:val="VerbatimChar"/>
+        </w:rPr>
+        <w:t xml:space="preserve">Updated</w:t>
+      </w:r>
+      <w:r>
+        <w:t xml:space="preserve"> </w:t>
+      </w:r>
+      <w:r>
+        <w:rPr>
+          <w:rStyle w:val="VerbatimChar"/>
+        </w:rPr>
+        <w:t xml:space="preserve">item_history</w:t>
+      </w:r>
+      <w:r>
+        <w:t xml:space="preserve"> </w:t>
+      </w:r>
+      <w:r>
+        <w:t xml:space="preserve">row, rejects terminal statuses (pointing to</w:t>
+      </w:r>
+      <w:r>
+        <w:t xml:space="preserve"> </w:t>
+      </w:r>
+      <w:r>
+        <w:rPr>
+          <w:rStyle w:val="VerbatimChar"/>
+        </w:rPr>
+        <w:t xml:space="preserve">close</w:t>
+      </w:r>
+      <w:r>
+        <w:t xml:space="preserve">) and</w:t>
+      </w:r>
+      <w:r>
+        <w:t xml:space="preserve"> </w:t>
+      </w:r>
+      <w:r>
+        <w:t xml:space="preserve">unknown statuses (§11.4.6 — no silent default). Guarded by</w:t>
+      </w:r>
+      <w:r>
+        <w:t xml:space="preserve"> </w:t>
+      </w:r>
+      <w:r>
+        <w:rPr>
+          <w:rStyle w:val="VerbatimChar"/>
+        </w:rPr>
+        <w:t xml:space="preserve">cmd/workable-items/set_status_test.go</w:t>
+      </w:r>
+      <w:r>
+        <w:t xml:space="preserve"> </w:t>
+      </w:r>
+      <w:r>
+        <w:t xml:space="preserve">(6 cases).</w:t>
+      </w:r>
+      <w:r>
+        <w:t xml:space="preserve"> </w:t>
+      </w:r>
+      <w:r>
+        <w:rPr>
+          <w:b/>
+          <w:bCs/>
+        </w:rPr>
+        <w:t xml:space="preserve">Acceptance:</w:t>
+      </w:r>
+      <w:r>
+        <w:t xml:space="preserve"> </w:t>
+      </w:r>
+      <w:r>
+        <w:t xml:space="preserve">the command sets a</w:t>
+      </w:r>
+      <w:r>
+        <w:t xml:space="preserve"> </w:t>
+      </w:r>
+      <w:r>
+        <w:t xml:space="preserve">non-terminal status with an audit row and rejects terminal/unknown values —</w:t>
+      </w:r>
+      <w:r>
+        <w:t xml:space="preserve"> </w:t>
+      </w:r>
+      <w:r>
+        <w:rPr>
+          <w:rStyle w:val="VerbatimChar"/>
+        </w:rPr>
+        <w:t xml:space="preserve">go test ./cmd/workable-items</w:t>
+      </w:r>
+      <w:r>
+        <w:t xml:space="preserve"> </w:t>
+      </w:r>
+      <w:r>
+        <w:t xml:space="preserve">GREEN; pending conductor verification + close.</w:t>
       </w:r>
     </w:p>
     <w:p>
@@ -1327,8 +3948,9 @@
         </w:pict>
       </w:r>
     </w:p>
-    <w:bookmarkEnd w:id="13"/>
-    <w:bookmarkStart w:id="14" w:name="X274f73d5acf258963b31ff7c75a674bee0e935e"/>
+    <w:bookmarkEnd w:id="21"/>
+    <w:bookmarkEnd w:id="22"/>
+    <w:bookmarkStart w:id="23" w:name="X274f73d5acf258963b31ff7c75a674bee0e935e"/>
     <w:p>
       <w:pPr>
         <w:pStyle w:val="Heading2"/>
@@ -1364,8 +3986,8 @@
         </w:pict>
       </w:r>
     </w:p>
-    <w:bookmarkEnd w:id="14"/>
-    <w:bookmarkStart w:id="16" w:name="X9125c2495937530f0e64223858a8a5d6a10e5bd"/>
+    <w:bookmarkEnd w:id="23"/>
+    <w:bookmarkStart w:id="25" w:name="X9125c2495937530f0e64223858a8a5d6a10e5bd"/>
     <w:p>
       <w:pPr>
         <w:pStyle w:val="Heading2"/>
@@ -1374,7 +3996,7 @@
         <w:t xml:space="preserve">D. Host-capability + topology dispatch gaps</w:t>
       </w:r>
     </w:p>
-    <w:bookmarkStart w:id="15" w:name="X5e199cf37a7d6ff0313698f63b14d62e1213353"/>
+    <w:bookmarkStart w:id="24" w:name="X5e199cf37a7d6ff0313698f63b14d62e1213353"/>
     <w:p>
       <w:pPr>
         <w:pStyle w:val="Heading3"/>
@@ -1661,9 +4283,9 @@
         </w:pict>
       </w:r>
     </w:p>
-    <w:bookmarkEnd w:id="15"/>
-    <w:bookmarkEnd w:id="16"/>
-    <w:bookmarkStart w:id="17" w:name="e-documentation--continuation-drift"/>
+    <w:bookmarkEnd w:id="24"/>
+    <w:bookmarkEnd w:id="25"/>
+    <w:bookmarkStart w:id="27" w:name="e-documentation--continuation-drift"/>
     <w:p>
       <w:pPr>
         <w:pStyle w:val="Heading2"/>
@@ -1677,7 +4299,7 @@
         <w:pStyle w:val="FirstParagraph"/>
       </w:pPr>
       <w:r>
-        <w:t xml:space="preserve">(none open at this time; CONTINUATION.md §3 entries that resolve land in</w:t>
+        <w:t xml:space="preserve">(CONTINUATION.md §3 entries that resolve land in</w:t>
       </w:r>
       <w:r>
         <w:t xml:space="preserve"> </w:t>
@@ -1692,7 +4314,287 @@
         <w:t xml:space="preserve"> </w:t>
       </w:r>
       <w:r>
-        <w:t xml:space="preserve">per Constitution §5 / §12.10.)</w:t>
+        <w:t xml:space="preserve">per Constitution §5 / §12.10. New open work below.)</w:t>
+      </w:r>
+    </w:p>
+    <w:bookmarkStart w:id="26" w:name="X6f0f0cdf1270a78e1809a74636b1d49e28b5a39"/>
+    <w:p>
+      <w:pPr>
+        <w:pStyle w:val="Heading3"/>
+      </w:pPr>
+      <w:r>
+        <w:t xml:space="preserve">E50 INSTALL-DOC-PODMAN-HTTPS-001 — document the rootless-Podman subuid fix and the curl-installer HTTPS-rewrite edge —</w:t>
+      </w:r>
+      <w:r>
+        <w:t xml:space="preserve"> </w:t>
+      </w:r>
+      <w:r>
+        <w:rPr>
+          <w:rStyle w:val="VerbatimChar"/>
+        </w:rPr>
+        <w:t xml:space="preserve">OPEN</w:t>
+      </w:r>
+    </w:p>
+    <w:p>
+      <w:pPr>
+        <w:pStyle w:val="FirstParagraph"/>
+      </w:pPr>
+      <w:r>
+        <w:rPr>
+          <w:b/>
+          <w:bCs/>
+        </w:rPr>
+        <w:t xml:space="preserve">TMX-ID:</w:t>
+      </w:r>
+      <w:r>
+        <w:t xml:space="preserve"> </w:t>
+      </w:r>
+      <w:r>
+        <w:t xml:space="preserve">TMX-058</w:t>
+      </w:r>
+      <w:r>
+        <w:t xml:space="preserve"> </w:t>
+      </w:r>
+      <w:r>
+        <w:rPr>
+          <w:b/>
+          <w:bCs/>
+        </w:rPr>
+        <w:t xml:space="preserve">Status:</w:t>
+      </w:r>
+      <w:r>
+        <w:t xml:space="preserve"> </w:t>
+      </w:r>
+      <w:r>
+        <w:rPr>
+          <w:rStyle w:val="VerbatimChar"/>
+        </w:rPr>
+        <w:t xml:space="preserve">OPEN</w:t>
+      </w:r>
+      <w:r>
+        <w:t xml:space="preserve"> </w:t>
+      </w:r>
+      <w:r>
+        <w:rPr>
+          <w:b/>
+          <w:bCs/>
+        </w:rPr>
+        <w:t xml:space="preserve">Type:</w:t>
+      </w:r>
+      <w:r>
+        <w:t xml:space="preserve"> </w:t>
+      </w:r>
+      <w:r>
+        <w:t xml:space="preserve">Task</w:t>
+      </w:r>
+      <w:r>
+        <w:t xml:space="preserve"> </w:t>
+      </w:r>
+      <w:r>
+        <w:rPr>
+          <w:b/>
+          <w:bCs/>
+        </w:rPr>
+        <w:t xml:space="preserve">Severity:</w:t>
+      </w:r>
+      <w:r>
+        <w:t xml:space="preserve"> </w:t>
+      </w:r>
+      <w:r>
+        <w:t xml:space="preserve">LOW</w:t>
+      </w:r>
+    </w:p>
+    <w:p>
+      <w:pPr>
+        <w:pStyle w:val="BodyText"/>
+      </w:pPr>
+      <w:r>
+        <w:t xml:space="preserve">v1.0.30 shipped a native-build fallback when rootless Podman exhausts</w:t>
+      </w:r>
+      <w:r>
+        <w:t xml:space="preserve"> </w:t>
+      </w:r>
+      <w:r>
+        <w:rPr>
+          <w:rStyle w:val="VerbatimChar"/>
+        </w:rPr>
+        <w:t xml:space="preserve">/etc/subuid</w:t>
+      </w:r>
+      <w:r>
+        <w:t xml:space="preserve"> </w:t>
+      </w:r>
+      <w:r>
+        <w:t xml:space="preserve">+</w:t>
+      </w:r>
+      <w:r>
+        <w:t xml:space="preserve"> </w:t>
+      </w:r>
+      <w:r>
+        <w:rPr>
+          <w:rStyle w:val="VerbatimChar"/>
+        </w:rPr>
+        <w:t xml:space="preserve">/etc/subgid</w:t>
+      </w:r>
+      <w:r>
+        <w:t xml:space="preserve"> </w:t>
+      </w:r>
+      <w:r>
+        <w:t xml:space="preserve">(</w:t>
+      </w:r>
+      <w:r>
+        <w:rPr>
+          <w:rStyle w:val="VerbatimChar"/>
+        </w:rPr>
+        <w:t xml:space="preserve">lchown … invalid argument</w:t>
+      </w:r>
+      <w:r>
+        <w:t xml:space="preserve">) and a</w:t>
+      </w:r>
+      <w:r>
+        <w:t xml:space="preserve"> </w:t>
+      </w:r>
+      <w:r>
+        <w:rPr>
+          <w:rStyle w:val="VerbatimChar"/>
+        </w:rPr>
+        <w:t xml:space="preserve">curl</w:t>
+      </w:r>
+      <w:r>
+        <w:t xml:space="preserve"> </w:t>
+      </w:r>
+      <w:r>
+        <w:t xml:space="preserve">one-liner installer, but the</w:t>
+      </w:r>
+      <w:r>
+        <w:t xml:space="preserve"> </w:t>
+      </w:r>
+      <w:r>
+        <w:t xml:space="preserve">operator-facing repair guidance lives only in the CHANGELOG.</w:t>
+      </w:r>
+      <w:r>
+        <w:t xml:space="preserve"> </w:t>
+      </w:r>
+      <w:r>
+        <w:rPr>
+          <w:b/>
+          <w:bCs/>
+        </w:rPr>
+        <w:t xml:space="preserve">Fix direction:</w:t>
+      </w:r>
+      <w:r>
+        <w:t xml:space="preserve"> </w:t>
+      </w:r>
+      <w:r>
+        <w:t xml:space="preserve">document the</w:t>
+      </w:r>
+      <w:r>
+        <w:t xml:space="preserve"> </w:t>
+      </w:r>
+      <w:r>
+        <w:rPr>
+          <w:rStyle w:val="VerbatimChar"/>
+        </w:rPr>
+        <w:t xml:space="preserve">usermod --add-subuids/--add-subgids</w:t>
+      </w:r>
+      <w:r>
+        <w:t xml:space="preserve"> </w:t>
+      </w:r>
+      <w:r>
+        <w:t xml:space="preserve">+</w:t>
+      </w:r>
+      <w:r>
+        <w:t xml:space="preserve"> </w:t>
+      </w:r>
+      <w:r>
+        <w:rPr>
+          <w:rStyle w:val="VerbatimChar"/>
+        </w:rPr>
+        <w:t xml:space="preserve">podman system migrate</w:t>
+      </w:r>
+      <w:r>
+        <w:t xml:space="preserve"> </w:t>
+      </w:r>
+      <w:r>
+        <w:t xml:space="preserve">repair recipe AND the</w:t>
+      </w:r>
+      <w:r>
+        <w:t xml:space="preserve"> </w:t>
+      </w:r>
+      <w:r>
+        <w:t xml:space="preserve">install HTTPS-rewrite edge in</w:t>
+      </w:r>
+      <w:r>
+        <w:t xml:space="preserve"> </w:t>
+      </w:r>
+      <w:r>
+        <w:rPr>
+          <w:rStyle w:val="VerbatimChar"/>
+        </w:rPr>
+        <w:t xml:space="preserve">docs/guides</w:t>
+      </w:r>
+      <w:r>
+        <w:t xml:space="preserve"> </w:t>
+      </w:r>
+      <w:r>
+        <w:t xml:space="preserve">+</w:t>
+      </w:r>
+      <w:r>
+        <w:t xml:space="preserve"> </w:t>
+      </w:r>
+      <w:r>
+        <w:rPr>
+          <w:rStyle w:val="VerbatimChar"/>
+        </w:rPr>
+        <w:t xml:space="preserve">docs/scripts</w:t>
+      </w:r>
+      <w:r>
+        <w:t xml:space="preserve"> </w:t>
+      </w:r>
+      <w:r>
+        <w:t xml:space="preserve">so an end user hitting either</w:t>
+      </w:r>
+      <w:r>
+        <w:t xml:space="preserve"> </w:t>
+      </w:r>
+      <w:r>
+        <w:t xml:space="preserve">can self-recover.</w:t>
+      </w:r>
+      <w:r>
+        <w:t xml:space="preserve"> </w:t>
+      </w:r>
+      <w:r>
+        <w:rPr>
+          <w:b/>
+          <w:bCs/>
+        </w:rPr>
+        <w:t xml:space="preserve">Acceptance:</w:t>
+      </w:r>
+      <w:r>
+        <w:t xml:space="preserve"> </w:t>
+      </w:r>
+      <w:r>
+        <w:t xml:space="preserve">a docs page (synced HTML/PDF per §11.4.65) reproduces the</w:t>
+      </w:r>
+      <w:r>
+        <w:t xml:space="preserve"> </w:t>
+      </w:r>
+      <w:r>
+        <w:t xml:space="preserve">repair steps, verified against the v1.0.30</w:t>
+      </w:r>
+      <w:r>
+        <w:t xml:space="preserve"> </w:t>
+      </w:r>
+      <w:r>
+        <w:rPr>
+          <w:rStyle w:val="VerbatimChar"/>
+        </w:rPr>
+        <w:t xml:space="preserve">setup.sh</w:t>
+      </w:r>
+      <w:r>
+        <w:t xml:space="preserve"> </w:t>
+      </w:r>
+      <w:r>
+        <w:t xml:space="preserve">fallback path.</w:t>
       </w:r>
     </w:p>
     <w:p>
@@ -1702,8 +4604,9 @@
         </w:pict>
       </w:r>
     </w:p>
-    <w:bookmarkEnd w:id="17"/>
-    <w:bookmarkStart w:id="19" w:name="X250669e1b3e4eec2b5ccf8718eb9d17180ea6b1"/>
+    <w:bookmarkEnd w:id="26"/>
+    <w:bookmarkEnd w:id="27"/>
+    <w:bookmarkStart w:id="29" w:name="X250669e1b3e4eec2b5ccf8718eb9d17180ea6b1"/>
     <w:p>
       <w:pPr>
         <w:pStyle w:val="Heading2"/>
@@ -1884,7 +4787,7 @@
         </w:pict>
       </w:r>
     </w:p>
-    <w:bookmarkStart w:id="18" w:name="Xe31083bb0761d75e7125b868426f17a6f4d6047"/>
+    <w:bookmarkStart w:id="28" w:name="Xe31083bb0761d75e7125b868426f17a6f4d6047"/>
     <w:p>
       <w:pPr>
         <w:pStyle w:val="Heading3"/>
@@ -2226,9 +5129,9 @@
         <w:t xml:space="preserve">the per-session-color feature (TMX-051). Tracked separately so the color release is not blocked by an unrelated pre-existing test-gap.</w:t>
       </w:r>
     </w:p>
-    <w:bookmarkEnd w:id="18"/>
-    <w:bookmarkEnd w:id="19"/>
-    <w:bookmarkEnd w:id="20"/>
+    <w:bookmarkEnd w:id="28"/>
+    <w:bookmarkEnd w:id="29"/>
+    <w:bookmarkEnd w:id="30"/>
     <w:sectPr>
       <w:footnotePr>
         <w:numRestart w:val="eachSect"/>

</xml_diff>